<commit_message>
lab reports was add, lab_04 was add
</commit_message>
<xml_diff>
--- a/TP-KB-231-Viacheslav-saievskyi-lpr.docx
+++ b/TP-KB-231-Viacheslav-saievskyi-lpr.docx
@@ -315,6 +315,7 @@
               </w:rPr>
               <w:t>row</w:t>
             </w:r>
+            <w:proofErr w:type="gramStart"/>
             <w:r>
               <w:rPr>
                 <w:rFonts w:ascii="Consolas" w:eastAsia="Times New Roman" w:hAnsi="Consolas" w:cs="Times New Roman"/>
@@ -324,6 +325,7 @@
               </w:rPr>
               <w:t>[::</w:t>
             </w:r>
+            <w:proofErr w:type="gramEnd"/>
             <w:r>
               <w:rPr>
                 <w:rFonts w:ascii="Consolas" w:eastAsia="Times New Roman" w:hAnsi="Consolas" w:cs="Times New Roman"/>
@@ -381,7 +383,97 @@
           <w:bCs/>
           <w:lang w:val="uk-UA"/>
         </w:rPr>
-        <w:t>Виконати тестування функцій, що працюють з рядками: strip(), capitalize(), title(), upper(), lower().</w:t>
+        <w:t xml:space="preserve">Виконати тестування функцій, що працюють з рядками: </w:t>
+      </w:r>
+      <w:proofErr w:type="spellStart"/>
+      <w:r>
+        <w:rPr>
+          <w:b/>
+          <w:bCs/>
+          <w:lang w:val="uk-UA"/>
+        </w:rPr>
+        <w:t>strip</w:t>
+      </w:r>
+      <w:proofErr w:type="spellEnd"/>
+      <w:r>
+        <w:rPr>
+          <w:b/>
+          <w:bCs/>
+          <w:lang w:val="uk-UA"/>
+        </w:rPr>
+        <w:t xml:space="preserve">(), </w:t>
+      </w:r>
+      <w:proofErr w:type="spellStart"/>
+      <w:r>
+        <w:rPr>
+          <w:b/>
+          <w:bCs/>
+          <w:lang w:val="uk-UA"/>
+        </w:rPr>
+        <w:t>capitalize</w:t>
+      </w:r>
+      <w:proofErr w:type="spellEnd"/>
+      <w:r>
+        <w:rPr>
+          <w:b/>
+          <w:bCs/>
+          <w:lang w:val="uk-UA"/>
+        </w:rPr>
+        <w:t xml:space="preserve">(), </w:t>
+      </w:r>
+      <w:proofErr w:type="spellStart"/>
+      <w:r>
+        <w:rPr>
+          <w:b/>
+          <w:bCs/>
+          <w:lang w:val="uk-UA"/>
+        </w:rPr>
+        <w:t>title</w:t>
+      </w:r>
+      <w:proofErr w:type="spellEnd"/>
+      <w:r>
+        <w:rPr>
+          <w:b/>
+          <w:bCs/>
+          <w:lang w:val="uk-UA"/>
+        </w:rPr>
+        <w:t xml:space="preserve">(), </w:t>
+      </w:r>
+      <w:proofErr w:type="spellStart"/>
+      <w:r>
+        <w:rPr>
+          <w:b/>
+          <w:bCs/>
+          <w:lang w:val="uk-UA"/>
+        </w:rPr>
+        <w:t>upper</w:t>
+      </w:r>
+      <w:proofErr w:type="spellEnd"/>
+      <w:r>
+        <w:rPr>
+          <w:b/>
+          <w:bCs/>
+          <w:lang w:val="uk-UA"/>
+        </w:rPr>
+        <w:t xml:space="preserve">(), </w:t>
+      </w:r>
+      <w:proofErr w:type="spellStart"/>
+      <w:r>
+        <w:rPr>
+          <w:b/>
+          <w:bCs/>
+          <w:lang w:val="uk-UA"/>
+        </w:rPr>
+        <w:t>lower</w:t>
+      </w:r>
+      <w:proofErr w:type="spellEnd"/>
+      <w:r>
+        <w:rPr>
+          <w:b/>
+          <w:bCs/>
+          <w:lang w:val="uk-UA"/>
+        </w:rPr>
+        <w:t>().</w:t>
       </w:r>
     </w:p>
     <w:p>
@@ -413,7 +505,77 @@
         <w:rPr>
           <w:lang w:val="uk-UA"/>
         </w:rPr>
-        <w:t xml:space="preserve"> з текстом як: strip(), capitalize(), title(), upper(), lower().</w:t>
+        <w:t xml:space="preserve"> з текстом як: </w:t>
+      </w:r>
+      <w:proofErr w:type="spellStart"/>
+      <w:r>
+        <w:rPr>
+          <w:lang w:val="uk-UA"/>
+        </w:rPr>
+        <w:t>strip</w:t>
+      </w:r>
+      <w:proofErr w:type="spellEnd"/>
+      <w:r>
+        <w:rPr>
+          <w:lang w:val="uk-UA"/>
+        </w:rPr>
+        <w:t xml:space="preserve">(), </w:t>
+      </w:r>
+      <w:proofErr w:type="spellStart"/>
+      <w:r>
+        <w:rPr>
+          <w:lang w:val="uk-UA"/>
+        </w:rPr>
+        <w:t>capitalize</w:t>
+      </w:r>
+      <w:proofErr w:type="spellEnd"/>
+      <w:r>
+        <w:rPr>
+          <w:lang w:val="uk-UA"/>
+        </w:rPr>
+        <w:t xml:space="preserve">(), </w:t>
+      </w:r>
+      <w:proofErr w:type="spellStart"/>
+      <w:r>
+        <w:rPr>
+          <w:lang w:val="uk-UA"/>
+        </w:rPr>
+        <w:t>title</w:t>
+      </w:r>
+      <w:proofErr w:type="spellEnd"/>
+      <w:r>
+        <w:rPr>
+          <w:lang w:val="uk-UA"/>
+        </w:rPr>
+        <w:t xml:space="preserve">(), </w:t>
+      </w:r>
+      <w:proofErr w:type="spellStart"/>
+      <w:r>
+        <w:rPr>
+          <w:lang w:val="uk-UA"/>
+        </w:rPr>
+        <w:t>upper</w:t>
+      </w:r>
+      <w:proofErr w:type="spellEnd"/>
+      <w:r>
+        <w:rPr>
+          <w:lang w:val="uk-UA"/>
+        </w:rPr>
+        <w:t xml:space="preserve">(), </w:t>
+      </w:r>
+      <w:proofErr w:type="spellStart"/>
+      <w:r>
+        <w:rPr>
+          <w:lang w:val="uk-UA"/>
+        </w:rPr>
+        <w:t>lower</w:t>
+      </w:r>
+      <w:proofErr w:type="spellEnd"/>
+      <w:r>
+        <w:rPr>
+          <w:lang w:val="uk-UA"/>
+        </w:rPr>
+        <w:t>().</w:t>
       </w:r>
     </w:p>
     <w:p>
@@ -497,6 +659,7 @@
                 <w:szCs w:val="21"/>
               </w:rPr>
             </w:pPr>
+            <w:proofErr w:type="spellStart"/>
             <w:r>
               <w:rPr>
                 <w:rFonts w:ascii="Consolas" w:eastAsia="Times New Roman" w:hAnsi="Consolas" w:cs="Times New Roman"/>
@@ -506,6 +669,7 @@
               </w:rPr>
               <w:t>my_string</w:t>
             </w:r>
+            <w:proofErr w:type="spellEnd"/>
             <w:r>
               <w:rPr>
                 <w:rFonts w:ascii="Consolas" w:eastAsia="Times New Roman" w:hAnsi="Consolas" w:cs="Times New Roman"/>
@@ -540,7 +704,27 @@
                 <w:sz w:val="21"/>
                 <w:szCs w:val="21"/>
               </w:rPr>
-              <w:t>"    slava go home    "</w:t>
+              <w:t>"    </w:t>
+            </w:r>
+            <w:proofErr w:type="spellStart"/>
+            <w:r>
+              <w:rPr>
+                <w:rFonts w:ascii="Consolas" w:eastAsia="Times New Roman" w:hAnsi="Consolas" w:cs="Times New Roman"/>
+                <w:color w:val="CE9178"/>
+                <w:sz w:val="21"/>
+                <w:szCs w:val="21"/>
+              </w:rPr>
+              <w:t>slava</w:t>
+            </w:r>
+            <w:proofErr w:type="spellEnd"/>
+            <w:r>
+              <w:rPr>
+                <w:rFonts w:ascii="Consolas" w:eastAsia="Times New Roman" w:hAnsi="Consolas" w:cs="Times New Roman"/>
+                <w:color w:val="CE9178"/>
+                <w:sz w:val="21"/>
+                <w:szCs w:val="21"/>
+              </w:rPr>
+              <w:t xml:space="preserve"> go home    "</w:t>
             </w:r>
           </w:p>
           <w:p>
@@ -556,6 +740,7 @@
                 <w:szCs w:val="21"/>
               </w:rPr>
             </w:pPr>
+            <w:proofErr w:type="spellStart"/>
             <w:r>
               <w:rPr>
                 <w:rFonts w:ascii="Consolas" w:eastAsia="Times New Roman" w:hAnsi="Consolas" w:cs="Times New Roman"/>
@@ -565,6 +750,7 @@
               </w:rPr>
               <w:t>striped_string</w:t>
             </w:r>
+            <w:proofErr w:type="spellEnd"/>
             <w:r>
               <w:rPr>
                 <w:rFonts w:ascii="Consolas" w:eastAsia="Times New Roman" w:hAnsi="Consolas" w:cs="Times New Roman"/>
@@ -592,6 +778,7 @@
               </w:rPr>
               <w:t xml:space="preserve"> </w:t>
             </w:r>
+            <w:proofErr w:type="spellStart"/>
             <w:r>
               <w:rPr>
                 <w:rFonts w:ascii="Consolas" w:eastAsia="Times New Roman" w:hAnsi="Consolas" w:cs="Times New Roman"/>
@@ -599,7 +786,17 @@
                 <w:sz w:val="21"/>
                 <w:szCs w:val="21"/>
               </w:rPr>
-              <w:t>my_string</w:t>
+              <w:t>my_</w:t>
+            </w:r>
+            <w:proofErr w:type="gramStart"/>
+            <w:r>
+              <w:rPr>
+                <w:rFonts w:ascii="Consolas" w:eastAsia="Times New Roman" w:hAnsi="Consolas" w:cs="Times New Roman"/>
+                <w:color w:val="9CDCFE"/>
+                <w:sz w:val="21"/>
+                <w:szCs w:val="21"/>
+              </w:rPr>
+              <w:t>string</w:t>
             </w:r>
             <w:r>
               <w:rPr>
@@ -619,6 +816,8 @@
               </w:rPr>
               <w:t>strip</w:t>
             </w:r>
+            <w:proofErr w:type="spellEnd"/>
+            <w:proofErr w:type="gramEnd"/>
             <w:r>
               <w:rPr>
                 <w:rFonts w:ascii="Consolas" w:eastAsia="Times New Roman" w:hAnsi="Consolas" w:cs="Times New Roman"/>
@@ -642,6 +841,7 @@
                 <w:szCs w:val="21"/>
               </w:rPr>
             </w:pPr>
+            <w:proofErr w:type="gramStart"/>
             <w:r>
               <w:rPr>
                 <w:rFonts w:ascii="Consolas" w:eastAsia="Times New Roman" w:hAnsi="Consolas" w:cs="Times New Roman"/>
@@ -660,6 +860,8 @@
               </w:rPr>
               <w:t>(</w:t>
             </w:r>
+            <w:proofErr w:type="spellStart"/>
+            <w:proofErr w:type="gramEnd"/>
             <w:r>
               <w:rPr>
                 <w:rFonts w:ascii="Consolas" w:eastAsia="Times New Roman" w:hAnsi="Consolas" w:cs="Times New Roman"/>
@@ -676,7 +878,17 @@
                 <w:sz w:val="21"/>
                 <w:szCs w:val="21"/>
               </w:rPr>
-              <w:t>"Started string: '</w:t>
+              <w:t>"Started</w:t>
+            </w:r>
+            <w:proofErr w:type="spellEnd"/>
+            <w:r>
+              <w:rPr>
+                <w:rFonts w:ascii="Consolas" w:eastAsia="Times New Roman" w:hAnsi="Consolas" w:cs="Times New Roman"/>
+                <w:color w:val="CE9178"/>
+                <w:sz w:val="21"/>
+                <w:szCs w:val="21"/>
+              </w:rPr>
+              <w:t xml:space="preserve"> string: '</w:t>
             </w:r>
             <w:r>
               <w:rPr>
@@ -687,6 +899,7 @@
               </w:rPr>
               <w:t>{</w:t>
             </w:r>
+            <w:proofErr w:type="spellStart"/>
             <w:r>
               <w:rPr>
                 <w:rFonts w:ascii="Consolas" w:eastAsia="Times New Roman" w:hAnsi="Consolas" w:cs="Times New Roman"/>
@@ -696,6 +909,7 @@
               </w:rPr>
               <w:t>my_string</w:t>
             </w:r>
+            <w:proofErr w:type="spellEnd"/>
             <w:r>
               <w:rPr>
                 <w:rFonts w:ascii="Consolas" w:eastAsia="Times New Roman" w:hAnsi="Consolas" w:cs="Times New Roman"/>
@@ -721,7 +935,17 @@
                 <w:sz w:val="21"/>
                 <w:szCs w:val="21"/>
               </w:rPr>
-              <w:t>\n</w:t>
+              <w:t>\</w:t>
+            </w:r>
+            <w:proofErr w:type="spellStart"/>
+            <w:r>
+              <w:rPr>
+                <w:rFonts w:ascii="Consolas" w:eastAsia="Times New Roman" w:hAnsi="Consolas" w:cs="Times New Roman"/>
+                <w:color w:val="D7BA7D"/>
+                <w:sz w:val="21"/>
+                <w:szCs w:val="21"/>
+              </w:rPr>
+              <w:t>n</w:t>
             </w:r>
             <w:r>
               <w:rPr>
@@ -730,7 +954,17 @@
                 <w:sz w:val="21"/>
                 <w:szCs w:val="21"/>
               </w:rPr>
-              <w:t>Striped string: '</w:t>
+              <w:t>Striped</w:t>
+            </w:r>
+            <w:proofErr w:type="spellEnd"/>
+            <w:r>
+              <w:rPr>
+                <w:rFonts w:ascii="Consolas" w:eastAsia="Times New Roman" w:hAnsi="Consolas" w:cs="Times New Roman"/>
+                <w:color w:val="CE9178"/>
+                <w:sz w:val="21"/>
+                <w:szCs w:val="21"/>
+              </w:rPr>
+              <w:t xml:space="preserve"> string: '</w:t>
             </w:r>
             <w:r>
               <w:rPr>
@@ -741,6 +975,7 @@
               </w:rPr>
               <w:t>{</w:t>
             </w:r>
+            <w:proofErr w:type="spellStart"/>
             <w:r>
               <w:rPr>
                 <w:rFonts w:ascii="Consolas" w:eastAsia="Times New Roman" w:hAnsi="Consolas" w:cs="Times New Roman"/>
@@ -750,6 +985,7 @@
               </w:rPr>
               <w:t>striped_string</w:t>
             </w:r>
+            <w:proofErr w:type="spellEnd"/>
             <w:r>
               <w:rPr>
                 <w:rFonts w:ascii="Consolas" w:eastAsia="Times New Roman" w:hAnsi="Consolas" w:cs="Times New Roman"/>
@@ -823,6 +1059,7 @@
                 <w:szCs w:val="21"/>
               </w:rPr>
             </w:pPr>
+            <w:proofErr w:type="spellStart"/>
             <w:r>
               <w:rPr>
                 <w:rFonts w:ascii="Consolas" w:eastAsia="Times New Roman" w:hAnsi="Consolas" w:cs="Times New Roman"/>
@@ -832,6 +1069,7 @@
               </w:rPr>
               <w:t>my_string</w:t>
             </w:r>
+            <w:proofErr w:type="spellEnd"/>
             <w:r>
               <w:rPr>
                 <w:rFonts w:ascii="Consolas" w:eastAsia="Times New Roman" w:hAnsi="Consolas" w:cs="Times New Roman"/>
@@ -866,7 +1104,27 @@
                 <w:sz w:val="21"/>
                 <w:szCs w:val="21"/>
               </w:rPr>
-              <w:t>"slava go home"</w:t>
+              <w:t>"</w:t>
+            </w:r>
+            <w:proofErr w:type="spellStart"/>
+            <w:r>
+              <w:rPr>
+                <w:rFonts w:ascii="Consolas" w:eastAsia="Times New Roman" w:hAnsi="Consolas" w:cs="Times New Roman"/>
+                <w:color w:val="CE9178"/>
+                <w:sz w:val="21"/>
+                <w:szCs w:val="21"/>
+              </w:rPr>
+              <w:t>slava</w:t>
+            </w:r>
+            <w:proofErr w:type="spellEnd"/>
+            <w:r>
+              <w:rPr>
+                <w:rFonts w:ascii="Consolas" w:eastAsia="Times New Roman" w:hAnsi="Consolas" w:cs="Times New Roman"/>
+                <w:color w:val="CE9178"/>
+                <w:sz w:val="21"/>
+                <w:szCs w:val="21"/>
+              </w:rPr>
+              <w:t xml:space="preserve"> go home"</w:t>
             </w:r>
           </w:p>
           <w:p>
@@ -882,6 +1140,7 @@
                 <w:szCs w:val="21"/>
               </w:rPr>
             </w:pPr>
+            <w:proofErr w:type="spellStart"/>
             <w:r>
               <w:rPr>
                 <w:rFonts w:ascii="Consolas" w:eastAsia="Times New Roman" w:hAnsi="Consolas" w:cs="Times New Roman"/>
@@ -891,6 +1150,7 @@
               </w:rPr>
               <w:t>capitalized_string</w:t>
             </w:r>
+            <w:proofErr w:type="spellEnd"/>
             <w:r>
               <w:rPr>
                 <w:rFonts w:ascii="Consolas" w:eastAsia="Times New Roman" w:hAnsi="Consolas" w:cs="Times New Roman"/>
@@ -918,6 +1178,7 @@
               </w:rPr>
               <w:t xml:space="preserve"> </w:t>
             </w:r>
+            <w:proofErr w:type="spellStart"/>
             <w:r>
               <w:rPr>
                 <w:rFonts w:ascii="Consolas" w:eastAsia="Times New Roman" w:hAnsi="Consolas" w:cs="Times New Roman"/>
@@ -925,7 +1186,17 @@
                 <w:sz w:val="21"/>
                 <w:szCs w:val="21"/>
               </w:rPr>
-              <w:t>my_string</w:t>
+              <w:t>my_</w:t>
+            </w:r>
+            <w:proofErr w:type="gramStart"/>
+            <w:r>
+              <w:rPr>
+                <w:rFonts w:ascii="Consolas" w:eastAsia="Times New Roman" w:hAnsi="Consolas" w:cs="Times New Roman"/>
+                <w:color w:val="9CDCFE"/>
+                <w:sz w:val="21"/>
+                <w:szCs w:val="21"/>
+              </w:rPr>
+              <w:t>string</w:t>
             </w:r>
             <w:r>
               <w:rPr>
@@ -945,6 +1216,8 @@
               </w:rPr>
               <w:t>capitalize</w:t>
             </w:r>
+            <w:proofErr w:type="spellEnd"/>
+            <w:proofErr w:type="gramEnd"/>
             <w:r>
               <w:rPr>
                 <w:rFonts w:ascii="Consolas" w:eastAsia="Times New Roman" w:hAnsi="Consolas" w:cs="Times New Roman"/>
@@ -968,6 +1241,7 @@
                 <w:szCs w:val="21"/>
               </w:rPr>
             </w:pPr>
+            <w:proofErr w:type="gramStart"/>
             <w:r>
               <w:rPr>
                 <w:rFonts w:ascii="Consolas" w:eastAsia="Times New Roman" w:hAnsi="Consolas" w:cs="Times New Roman"/>
@@ -986,6 +1260,8 @@
               </w:rPr>
               <w:t>(</w:t>
             </w:r>
+            <w:proofErr w:type="spellStart"/>
+            <w:proofErr w:type="gramEnd"/>
             <w:r>
               <w:rPr>
                 <w:rFonts w:ascii="Consolas" w:eastAsia="Times New Roman" w:hAnsi="Consolas" w:cs="Times New Roman"/>
@@ -1002,7 +1278,17 @@
                 <w:sz w:val="21"/>
                 <w:szCs w:val="21"/>
               </w:rPr>
-              <w:t>"Started string: '</w:t>
+              <w:t>"Started</w:t>
+            </w:r>
+            <w:proofErr w:type="spellEnd"/>
+            <w:r>
+              <w:rPr>
+                <w:rFonts w:ascii="Consolas" w:eastAsia="Times New Roman" w:hAnsi="Consolas" w:cs="Times New Roman"/>
+                <w:color w:val="CE9178"/>
+                <w:sz w:val="21"/>
+                <w:szCs w:val="21"/>
+              </w:rPr>
+              <w:t xml:space="preserve"> string: '</w:t>
             </w:r>
             <w:r>
               <w:rPr>
@@ -1013,6 +1299,7 @@
               </w:rPr>
               <w:t>{</w:t>
             </w:r>
+            <w:proofErr w:type="spellStart"/>
             <w:r>
               <w:rPr>
                 <w:rFonts w:ascii="Consolas" w:eastAsia="Times New Roman" w:hAnsi="Consolas" w:cs="Times New Roman"/>
@@ -1022,6 +1309,7 @@
               </w:rPr>
               <w:t>my_string</w:t>
             </w:r>
+            <w:proofErr w:type="spellEnd"/>
             <w:r>
               <w:rPr>
                 <w:rFonts w:ascii="Consolas" w:eastAsia="Times New Roman" w:hAnsi="Consolas" w:cs="Times New Roman"/>
@@ -1047,7 +1335,17 @@
                 <w:sz w:val="21"/>
                 <w:szCs w:val="21"/>
               </w:rPr>
-              <w:t>\n</w:t>
+              <w:t>\</w:t>
+            </w:r>
+            <w:proofErr w:type="spellStart"/>
+            <w:r>
+              <w:rPr>
+                <w:rFonts w:ascii="Consolas" w:eastAsia="Times New Roman" w:hAnsi="Consolas" w:cs="Times New Roman"/>
+                <w:color w:val="D7BA7D"/>
+                <w:sz w:val="21"/>
+                <w:szCs w:val="21"/>
+              </w:rPr>
+              <w:t>n</w:t>
             </w:r>
             <w:r>
               <w:rPr>
@@ -1056,7 +1354,17 @@
                 <w:sz w:val="21"/>
                 <w:szCs w:val="21"/>
               </w:rPr>
-              <w:t>Capitalized string: '</w:t>
+              <w:t>Capitalized</w:t>
+            </w:r>
+            <w:proofErr w:type="spellEnd"/>
+            <w:r>
+              <w:rPr>
+                <w:rFonts w:ascii="Consolas" w:eastAsia="Times New Roman" w:hAnsi="Consolas" w:cs="Times New Roman"/>
+                <w:color w:val="CE9178"/>
+                <w:sz w:val="21"/>
+                <w:szCs w:val="21"/>
+              </w:rPr>
+              <w:t xml:space="preserve"> string: '</w:t>
             </w:r>
             <w:r>
               <w:rPr>
@@ -1067,6 +1375,7 @@
               </w:rPr>
               <w:t>{</w:t>
             </w:r>
+            <w:proofErr w:type="spellStart"/>
             <w:r>
               <w:rPr>
                 <w:rFonts w:ascii="Consolas" w:eastAsia="Times New Roman" w:hAnsi="Consolas" w:cs="Times New Roman"/>
@@ -1076,6 +1385,7 @@
               </w:rPr>
               <w:t>capitalized_string</w:t>
             </w:r>
+            <w:proofErr w:type="spellEnd"/>
             <w:r>
               <w:rPr>
                 <w:rFonts w:ascii="Consolas" w:eastAsia="Times New Roman" w:hAnsi="Consolas" w:cs="Times New Roman"/>
@@ -1149,6 +1459,7 @@
                 <w:szCs w:val="21"/>
               </w:rPr>
             </w:pPr>
+            <w:proofErr w:type="spellStart"/>
             <w:r>
               <w:rPr>
                 <w:rFonts w:ascii="Consolas" w:eastAsia="Times New Roman" w:hAnsi="Consolas" w:cs="Times New Roman"/>
@@ -1158,6 +1469,7 @@
               </w:rPr>
               <w:t>my_string</w:t>
             </w:r>
+            <w:proofErr w:type="spellEnd"/>
             <w:r>
               <w:rPr>
                 <w:rFonts w:ascii="Consolas" w:eastAsia="Times New Roman" w:hAnsi="Consolas" w:cs="Times New Roman"/>
@@ -1192,7 +1504,27 @@
                 <w:sz w:val="21"/>
                 <w:szCs w:val="21"/>
               </w:rPr>
-              <w:t>"slava go home"</w:t>
+              <w:t>"</w:t>
+            </w:r>
+            <w:proofErr w:type="spellStart"/>
+            <w:r>
+              <w:rPr>
+                <w:rFonts w:ascii="Consolas" w:eastAsia="Times New Roman" w:hAnsi="Consolas" w:cs="Times New Roman"/>
+                <w:color w:val="CE9178"/>
+                <w:sz w:val="21"/>
+                <w:szCs w:val="21"/>
+              </w:rPr>
+              <w:t>slava</w:t>
+            </w:r>
+            <w:proofErr w:type="spellEnd"/>
+            <w:r>
+              <w:rPr>
+                <w:rFonts w:ascii="Consolas" w:eastAsia="Times New Roman" w:hAnsi="Consolas" w:cs="Times New Roman"/>
+                <w:color w:val="CE9178"/>
+                <w:sz w:val="21"/>
+                <w:szCs w:val="21"/>
+              </w:rPr>
+              <w:t xml:space="preserve"> go home"</w:t>
             </w:r>
           </w:p>
           <w:p>
@@ -1208,6 +1540,7 @@
                 <w:szCs w:val="21"/>
               </w:rPr>
             </w:pPr>
+            <w:proofErr w:type="spellStart"/>
             <w:r>
               <w:rPr>
                 <w:rFonts w:ascii="Consolas" w:eastAsia="Times New Roman" w:hAnsi="Consolas" w:cs="Times New Roman"/>
@@ -1217,6 +1550,7 @@
               </w:rPr>
               <w:t>titled_string</w:t>
             </w:r>
+            <w:proofErr w:type="spellEnd"/>
             <w:r>
               <w:rPr>
                 <w:rFonts w:ascii="Consolas" w:eastAsia="Times New Roman" w:hAnsi="Consolas" w:cs="Times New Roman"/>
@@ -1244,6 +1578,7 @@
               </w:rPr>
               <w:t xml:space="preserve"> </w:t>
             </w:r>
+            <w:proofErr w:type="spellStart"/>
             <w:r>
               <w:rPr>
                 <w:rFonts w:ascii="Consolas" w:eastAsia="Times New Roman" w:hAnsi="Consolas" w:cs="Times New Roman"/>
@@ -1251,7 +1586,17 @@
                 <w:sz w:val="21"/>
                 <w:szCs w:val="21"/>
               </w:rPr>
-              <w:t>my_string</w:t>
+              <w:t>my_</w:t>
+            </w:r>
+            <w:proofErr w:type="gramStart"/>
+            <w:r>
+              <w:rPr>
+                <w:rFonts w:ascii="Consolas" w:eastAsia="Times New Roman" w:hAnsi="Consolas" w:cs="Times New Roman"/>
+                <w:color w:val="9CDCFE"/>
+                <w:sz w:val="21"/>
+                <w:szCs w:val="21"/>
+              </w:rPr>
+              <w:t>string</w:t>
             </w:r>
             <w:r>
               <w:rPr>
@@ -1271,6 +1616,8 @@
               </w:rPr>
               <w:t>title</w:t>
             </w:r>
+            <w:proofErr w:type="spellEnd"/>
+            <w:proofErr w:type="gramEnd"/>
             <w:r>
               <w:rPr>
                 <w:rFonts w:ascii="Consolas" w:eastAsia="Times New Roman" w:hAnsi="Consolas" w:cs="Times New Roman"/>
@@ -1294,6 +1641,7 @@
                 <w:szCs w:val="21"/>
               </w:rPr>
             </w:pPr>
+            <w:proofErr w:type="gramStart"/>
             <w:r>
               <w:rPr>
                 <w:rFonts w:ascii="Consolas" w:eastAsia="Times New Roman" w:hAnsi="Consolas" w:cs="Times New Roman"/>
@@ -1312,6 +1660,8 @@
               </w:rPr>
               <w:t>(</w:t>
             </w:r>
+            <w:proofErr w:type="spellStart"/>
+            <w:proofErr w:type="gramEnd"/>
             <w:r>
               <w:rPr>
                 <w:rFonts w:ascii="Consolas" w:eastAsia="Times New Roman" w:hAnsi="Consolas" w:cs="Times New Roman"/>
@@ -1328,7 +1678,17 @@
                 <w:sz w:val="21"/>
                 <w:szCs w:val="21"/>
               </w:rPr>
-              <w:t>"Started string: '</w:t>
+              <w:t>"Started</w:t>
+            </w:r>
+            <w:proofErr w:type="spellEnd"/>
+            <w:r>
+              <w:rPr>
+                <w:rFonts w:ascii="Consolas" w:eastAsia="Times New Roman" w:hAnsi="Consolas" w:cs="Times New Roman"/>
+                <w:color w:val="CE9178"/>
+                <w:sz w:val="21"/>
+                <w:szCs w:val="21"/>
+              </w:rPr>
+              <w:t xml:space="preserve"> string: '</w:t>
             </w:r>
             <w:r>
               <w:rPr>
@@ -1339,6 +1699,7 @@
               </w:rPr>
               <w:t>{</w:t>
             </w:r>
+            <w:proofErr w:type="spellStart"/>
             <w:r>
               <w:rPr>
                 <w:rFonts w:ascii="Consolas" w:eastAsia="Times New Roman" w:hAnsi="Consolas" w:cs="Times New Roman"/>
@@ -1348,6 +1709,7 @@
               </w:rPr>
               <w:t>my_string</w:t>
             </w:r>
+            <w:proofErr w:type="spellEnd"/>
             <w:r>
               <w:rPr>
                 <w:rFonts w:ascii="Consolas" w:eastAsia="Times New Roman" w:hAnsi="Consolas" w:cs="Times New Roman"/>
@@ -1373,7 +1735,17 @@
                 <w:sz w:val="21"/>
                 <w:szCs w:val="21"/>
               </w:rPr>
-              <w:t>\n</w:t>
+              <w:t>\</w:t>
+            </w:r>
+            <w:proofErr w:type="spellStart"/>
+            <w:r>
+              <w:rPr>
+                <w:rFonts w:ascii="Consolas" w:eastAsia="Times New Roman" w:hAnsi="Consolas" w:cs="Times New Roman"/>
+                <w:color w:val="D7BA7D"/>
+                <w:sz w:val="21"/>
+                <w:szCs w:val="21"/>
+              </w:rPr>
+              <w:t>n</w:t>
             </w:r>
             <w:r>
               <w:rPr>
@@ -1382,7 +1754,17 @@
                 <w:sz w:val="21"/>
                 <w:szCs w:val="21"/>
               </w:rPr>
-              <w:t>Titled string: '</w:t>
+              <w:t>Titled</w:t>
+            </w:r>
+            <w:proofErr w:type="spellEnd"/>
+            <w:r>
+              <w:rPr>
+                <w:rFonts w:ascii="Consolas" w:eastAsia="Times New Roman" w:hAnsi="Consolas" w:cs="Times New Roman"/>
+                <w:color w:val="CE9178"/>
+                <w:sz w:val="21"/>
+                <w:szCs w:val="21"/>
+              </w:rPr>
+              <w:t xml:space="preserve"> string: '</w:t>
             </w:r>
             <w:r>
               <w:rPr>
@@ -1393,6 +1775,7 @@
               </w:rPr>
               <w:t>{</w:t>
             </w:r>
+            <w:proofErr w:type="spellStart"/>
             <w:r>
               <w:rPr>
                 <w:rFonts w:ascii="Consolas" w:eastAsia="Times New Roman" w:hAnsi="Consolas" w:cs="Times New Roman"/>
@@ -1402,6 +1785,7 @@
               </w:rPr>
               <w:t>titled_string</w:t>
             </w:r>
+            <w:proofErr w:type="spellEnd"/>
             <w:r>
               <w:rPr>
                 <w:rFonts w:ascii="Consolas" w:eastAsia="Times New Roman" w:hAnsi="Consolas" w:cs="Times New Roman"/>
@@ -1475,6 +1859,7 @@
                 <w:szCs w:val="21"/>
               </w:rPr>
             </w:pPr>
+            <w:proofErr w:type="spellStart"/>
             <w:r>
               <w:rPr>
                 <w:rFonts w:ascii="Consolas" w:eastAsia="Times New Roman" w:hAnsi="Consolas" w:cs="Times New Roman"/>
@@ -1484,6 +1869,7 @@
               </w:rPr>
               <w:t>my_string</w:t>
             </w:r>
+            <w:proofErr w:type="spellEnd"/>
             <w:r>
               <w:rPr>
                 <w:rFonts w:ascii="Consolas" w:eastAsia="Times New Roman" w:hAnsi="Consolas" w:cs="Times New Roman"/>
@@ -1518,7 +1904,27 @@
                 <w:sz w:val="21"/>
                 <w:szCs w:val="21"/>
               </w:rPr>
-              <w:t>"slava go home"</w:t>
+              <w:t>"</w:t>
+            </w:r>
+            <w:proofErr w:type="spellStart"/>
+            <w:r>
+              <w:rPr>
+                <w:rFonts w:ascii="Consolas" w:eastAsia="Times New Roman" w:hAnsi="Consolas" w:cs="Times New Roman"/>
+                <w:color w:val="CE9178"/>
+                <w:sz w:val="21"/>
+                <w:szCs w:val="21"/>
+              </w:rPr>
+              <w:t>slava</w:t>
+            </w:r>
+            <w:proofErr w:type="spellEnd"/>
+            <w:r>
+              <w:rPr>
+                <w:rFonts w:ascii="Consolas" w:eastAsia="Times New Roman" w:hAnsi="Consolas" w:cs="Times New Roman"/>
+                <w:color w:val="CE9178"/>
+                <w:sz w:val="21"/>
+                <w:szCs w:val="21"/>
+              </w:rPr>
+              <w:t xml:space="preserve"> go home"</w:t>
             </w:r>
           </w:p>
           <w:p>
@@ -1534,6 +1940,7 @@
                 <w:szCs w:val="21"/>
               </w:rPr>
             </w:pPr>
+            <w:proofErr w:type="spellStart"/>
             <w:r>
               <w:rPr>
                 <w:rFonts w:ascii="Consolas" w:eastAsia="Times New Roman" w:hAnsi="Consolas" w:cs="Times New Roman"/>
@@ -1543,6 +1950,7 @@
               </w:rPr>
               <w:t>uppered_string</w:t>
             </w:r>
+            <w:proofErr w:type="spellEnd"/>
             <w:r>
               <w:rPr>
                 <w:rFonts w:ascii="Consolas" w:eastAsia="Times New Roman" w:hAnsi="Consolas" w:cs="Times New Roman"/>
@@ -1570,6 +1978,7 @@
               </w:rPr>
               <w:t xml:space="preserve"> </w:t>
             </w:r>
+            <w:proofErr w:type="spellStart"/>
             <w:r>
               <w:rPr>
                 <w:rFonts w:ascii="Consolas" w:eastAsia="Times New Roman" w:hAnsi="Consolas" w:cs="Times New Roman"/>
@@ -1577,7 +1986,17 @@
                 <w:sz w:val="21"/>
                 <w:szCs w:val="21"/>
               </w:rPr>
-              <w:t>my_string</w:t>
+              <w:t>my_</w:t>
+            </w:r>
+            <w:proofErr w:type="gramStart"/>
+            <w:r>
+              <w:rPr>
+                <w:rFonts w:ascii="Consolas" w:eastAsia="Times New Roman" w:hAnsi="Consolas" w:cs="Times New Roman"/>
+                <w:color w:val="9CDCFE"/>
+                <w:sz w:val="21"/>
+                <w:szCs w:val="21"/>
+              </w:rPr>
+              <w:t>string</w:t>
             </w:r>
             <w:r>
               <w:rPr>
@@ -1597,6 +2016,8 @@
               </w:rPr>
               <w:t>upper</w:t>
             </w:r>
+            <w:proofErr w:type="spellEnd"/>
+            <w:proofErr w:type="gramEnd"/>
             <w:r>
               <w:rPr>
                 <w:rFonts w:ascii="Consolas" w:eastAsia="Times New Roman" w:hAnsi="Consolas" w:cs="Times New Roman"/>
@@ -1620,6 +2041,7 @@
                 <w:szCs w:val="21"/>
               </w:rPr>
             </w:pPr>
+            <w:proofErr w:type="gramStart"/>
             <w:r>
               <w:rPr>
                 <w:rFonts w:ascii="Consolas" w:eastAsia="Times New Roman" w:hAnsi="Consolas" w:cs="Times New Roman"/>
@@ -1638,6 +2060,8 @@
               </w:rPr>
               <w:t>(</w:t>
             </w:r>
+            <w:proofErr w:type="spellStart"/>
+            <w:proofErr w:type="gramEnd"/>
             <w:r>
               <w:rPr>
                 <w:rFonts w:ascii="Consolas" w:eastAsia="Times New Roman" w:hAnsi="Consolas" w:cs="Times New Roman"/>
@@ -1654,7 +2078,17 @@
                 <w:sz w:val="21"/>
                 <w:szCs w:val="21"/>
               </w:rPr>
-              <w:t>"Started string: '</w:t>
+              <w:t>"Started</w:t>
+            </w:r>
+            <w:proofErr w:type="spellEnd"/>
+            <w:r>
+              <w:rPr>
+                <w:rFonts w:ascii="Consolas" w:eastAsia="Times New Roman" w:hAnsi="Consolas" w:cs="Times New Roman"/>
+                <w:color w:val="CE9178"/>
+                <w:sz w:val="21"/>
+                <w:szCs w:val="21"/>
+              </w:rPr>
+              <w:t xml:space="preserve"> string: '</w:t>
             </w:r>
             <w:r>
               <w:rPr>
@@ -1665,6 +2099,7 @@
               </w:rPr>
               <w:t>{</w:t>
             </w:r>
+            <w:proofErr w:type="spellStart"/>
             <w:r>
               <w:rPr>
                 <w:rFonts w:ascii="Consolas" w:eastAsia="Times New Roman" w:hAnsi="Consolas" w:cs="Times New Roman"/>
@@ -1674,6 +2109,7 @@
               </w:rPr>
               <w:t>my_string</w:t>
             </w:r>
+            <w:proofErr w:type="spellEnd"/>
             <w:r>
               <w:rPr>
                 <w:rFonts w:ascii="Consolas" w:eastAsia="Times New Roman" w:hAnsi="Consolas" w:cs="Times New Roman"/>
@@ -1708,7 +2144,27 @@
                 <w:sz w:val="21"/>
                 <w:szCs w:val="21"/>
               </w:rPr>
-              <w:t xml:space="preserve"> Uppered string: '</w:t>
+              <w:t xml:space="preserve"> </w:t>
+            </w:r>
+            <w:proofErr w:type="spellStart"/>
+            <w:r>
+              <w:rPr>
+                <w:rFonts w:ascii="Consolas" w:eastAsia="Times New Roman" w:hAnsi="Consolas" w:cs="Times New Roman"/>
+                <w:color w:val="CE9178"/>
+                <w:sz w:val="21"/>
+                <w:szCs w:val="21"/>
+              </w:rPr>
+              <w:t>Uppered</w:t>
+            </w:r>
+            <w:proofErr w:type="spellEnd"/>
+            <w:r>
+              <w:rPr>
+                <w:rFonts w:ascii="Consolas" w:eastAsia="Times New Roman" w:hAnsi="Consolas" w:cs="Times New Roman"/>
+                <w:color w:val="CE9178"/>
+                <w:sz w:val="21"/>
+                <w:szCs w:val="21"/>
+              </w:rPr>
+              <w:t xml:space="preserve"> string: '</w:t>
             </w:r>
             <w:r>
               <w:rPr>
@@ -1719,6 +2175,7 @@
               </w:rPr>
               <w:t>{</w:t>
             </w:r>
+            <w:proofErr w:type="spellStart"/>
             <w:r>
               <w:rPr>
                 <w:rFonts w:ascii="Consolas" w:eastAsia="Times New Roman" w:hAnsi="Consolas" w:cs="Times New Roman"/>
@@ -1728,6 +2185,7 @@
               </w:rPr>
               <w:t>uppered_string</w:t>
             </w:r>
+            <w:proofErr w:type="spellEnd"/>
             <w:r>
               <w:rPr>
                 <w:rFonts w:ascii="Consolas" w:eastAsia="Times New Roman" w:hAnsi="Consolas" w:cs="Times New Roman"/>
@@ -1801,6 +2259,7 @@
                 <w:szCs w:val="21"/>
               </w:rPr>
             </w:pPr>
+            <w:proofErr w:type="spellStart"/>
             <w:r>
               <w:rPr>
                 <w:rFonts w:ascii="Consolas" w:eastAsia="Times New Roman" w:hAnsi="Consolas" w:cs="Times New Roman"/>
@@ -1810,6 +2269,7 @@
               </w:rPr>
               <w:t>my_string</w:t>
             </w:r>
+            <w:proofErr w:type="spellEnd"/>
             <w:r>
               <w:rPr>
                 <w:rFonts w:ascii="Consolas" w:eastAsia="Times New Roman" w:hAnsi="Consolas" w:cs="Times New Roman"/>
@@ -1844,7 +2304,67 @@
                 <w:sz w:val="21"/>
                 <w:szCs w:val="21"/>
               </w:rPr>
-              <w:t>"sLaVa gO HomE"</w:t>
+              <w:t>"</w:t>
+            </w:r>
+            <w:proofErr w:type="spellStart"/>
+            <w:r>
+              <w:rPr>
+                <w:rFonts w:ascii="Consolas" w:eastAsia="Times New Roman" w:hAnsi="Consolas" w:cs="Times New Roman"/>
+                <w:color w:val="CE9178"/>
+                <w:sz w:val="21"/>
+                <w:szCs w:val="21"/>
+              </w:rPr>
+              <w:t>sLaVa</w:t>
+            </w:r>
+            <w:proofErr w:type="spellEnd"/>
+            <w:r>
+              <w:rPr>
+                <w:rFonts w:ascii="Consolas" w:eastAsia="Times New Roman" w:hAnsi="Consolas" w:cs="Times New Roman"/>
+                <w:color w:val="CE9178"/>
+                <w:sz w:val="21"/>
+                <w:szCs w:val="21"/>
+              </w:rPr>
+              <w:t xml:space="preserve"> </w:t>
+            </w:r>
+            <w:proofErr w:type="spellStart"/>
+            <w:r>
+              <w:rPr>
+                <w:rFonts w:ascii="Consolas" w:eastAsia="Times New Roman" w:hAnsi="Consolas" w:cs="Times New Roman"/>
+                <w:color w:val="CE9178"/>
+                <w:sz w:val="21"/>
+                <w:szCs w:val="21"/>
+              </w:rPr>
+              <w:t>gO</w:t>
+            </w:r>
+            <w:proofErr w:type="spellEnd"/>
+            <w:r>
+              <w:rPr>
+                <w:rFonts w:ascii="Consolas" w:eastAsia="Times New Roman" w:hAnsi="Consolas" w:cs="Times New Roman"/>
+                <w:color w:val="CE9178"/>
+                <w:sz w:val="21"/>
+                <w:szCs w:val="21"/>
+              </w:rPr>
+              <w:t xml:space="preserve"> </w:t>
+            </w:r>
+            <w:proofErr w:type="spellStart"/>
+            <w:r>
+              <w:rPr>
+                <w:rFonts w:ascii="Consolas" w:eastAsia="Times New Roman" w:hAnsi="Consolas" w:cs="Times New Roman"/>
+                <w:color w:val="CE9178"/>
+                <w:sz w:val="21"/>
+                <w:szCs w:val="21"/>
+              </w:rPr>
+              <w:t>HomE</w:t>
+            </w:r>
+            <w:proofErr w:type="spellEnd"/>
+            <w:r>
+              <w:rPr>
+                <w:rFonts w:ascii="Consolas" w:eastAsia="Times New Roman" w:hAnsi="Consolas" w:cs="Times New Roman"/>
+                <w:color w:val="CE9178"/>
+                <w:sz w:val="21"/>
+                <w:szCs w:val="21"/>
+              </w:rPr>
+              <w:t>"</w:t>
             </w:r>
           </w:p>
           <w:p>
@@ -1860,6 +2380,7 @@
                 <w:szCs w:val="21"/>
               </w:rPr>
             </w:pPr>
+            <w:proofErr w:type="spellStart"/>
             <w:r>
               <w:rPr>
                 <w:rFonts w:ascii="Consolas" w:eastAsia="Times New Roman" w:hAnsi="Consolas" w:cs="Times New Roman"/>
@@ -1869,6 +2390,7 @@
               </w:rPr>
               <w:t>lowered_string</w:t>
             </w:r>
+            <w:proofErr w:type="spellEnd"/>
             <w:r>
               <w:rPr>
                 <w:rFonts w:ascii="Consolas" w:eastAsia="Times New Roman" w:hAnsi="Consolas" w:cs="Times New Roman"/>
@@ -1896,6 +2418,7 @@
               </w:rPr>
               <w:t xml:space="preserve"> </w:t>
             </w:r>
+            <w:proofErr w:type="spellStart"/>
             <w:r>
               <w:rPr>
                 <w:rFonts w:ascii="Consolas" w:eastAsia="Times New Roman" w:hAnsi="Consolas" w:cs="Times New Roman"/>
@@ -1903,7 +2426,17 @@
                 <w:sz w:val="21"/>
                 <w:szCs w:val="21"/>
               </w:rPr>
-              <w:t>my_string</w:t>
+              <w:t>my_</w:t>
+            </w:r>
+            <w:proofErr w:type="gramStart"/>
+            <w:r>
+              <w:rPr>
+                <w:rFonts w:ascii="Consolas" w:eastAsia="Times New Roman" w:hAnsi="Consolas" w:cs="Times New Roman"/>
+                <w:color w:val="9CDCFE"/>
+                <w:sz w:val="21"/>
+                <w:szCs w:val="21"/>
+              </w:rPr>
+              <w:t>string</w:t>
             </w:r>
             <w:r>
               <w:rPr>
@@ -1923,6 +2456,8 @@
               </w:rPr>
               <w:t>lower</w:t>
             </w:r>
+            <w:proofErr w:type="spellEnd"/>
+            <w:proofErr w:type="gramEnd"/>
             <w:r>
               <w:rPr>
                 <w:rFonts w:ascii="Consolas" w:eastAsia="Times New Roman" w:hAnsi="Consolas" w:cs="Times New Roman"/>
@@ -1946,6 +2481,7 @@
                 <w:szCs w:val="21"/>
               </w:rPr>
             </w:pPr>
+            <w:proofErr w:type="gramStart"/>
             <w:r>
               <w:rPr>
                 <w:rFonts w:ascii="Consolas" w:eastAsia="Times New Roman" w:hAnsi="Consolas" w:cs="Times New Roman"/>
@@ -1964,6 +2500,8 @@
               </w:rPr>
               <w:t>(</w:t>
             </w:r>
+            <w:proofErr w:type="spellStart"/>
+            <w:proofErr w:type="gramEnd"/>
             <w:r>
               <w:rPr>
                 <w:rFonts w:ascii="Consolas" w:eastAsia="Times New Roman" w:hAnsi="Consolas" w:cs="Times New Roman"/>
@@ -1980,7 +2518,17 @@
                 <w:sz w:val="21"/>
                 <w:szCs w:val="21"/>
               </w:rPr>
-              <w:t>"Started string: '</w:t>
+              <w:t>"Started</w:t>
+            </w:r>
+            <w:proofErr w:type="spellEnd"/>
+            <w:r>
+              <w:rPr>
+                <w:rFonts w:ascii="Consolas" w:eastAsia="Times New Roman" w:hAnsi="Consolas" w:cs="Times New Roman"/>
+                <w:color w:val="CE9178"/>
+                <w:sz w:val="21"/>
+                <w:szCs w:val="21"/>
+              </w:rPr>
+              <w:t xml:space="preserve"> string: '</w:t>
             </w:r>
             <w:r>
               <w:rPr>
@@ -1991,6 +2539,7 @@
               </w:rPr>
               <w:t>{</w:t>
             </w:r>
+            <w:proofErr w:type="spellStart"/>
             <w:r>
               <w:rPr>
                 <w:rFonts w:ascii="Consolas" w:eastAsia="Times New Roman" w:hAnsi="Consolas" w:cs="Times New Roman"/>
@@ -2000,6 +2549,7 @@
               </w:rPr>
               <w:t>my_string</w:t>
             </w:r>
+            <w:proofErr w:type="spellEnd"/>
             <w:r>
               <w:rPr>
                 <w:rFonts w:ascii="Consolas" w:eastAsia="Times New Roman" w:hAnsi="Consolas" w:cs="Times New Roman"/>
@@ -2025,7 +2575,17 @@
                 <w:sz w:val="21"/>
                 <w:szCs w:val="21"/>
               </w:rPr>
-              <w:t>\n</w:t>
+              <w:t>\</w:t>
+            </w:r>
+            <w:proofErr w:type="spellStart"/>
+            <w:r>
+              <w:rPr>
+                <w:rFonts w:ascii="Consolas" w:eastAsia="Times New Roman" w:hAnsi="Consolas" w:cs="Times New Roman"/>
+                <w:color w:val="D7BA7D"/>
+                <w:sz w:val="21"/>
+                <w:szCs w:val="21"/>
+              </w:rPr>
+              <w:t>n</w:t>
             </w:r>
             <w:r>
               <w:rPr>
@@ -2034,7 +2594,17 @@
                 <w:sz w:val="21"/>
                 <w:szCs w:val="21"/>
               </w:rPr>
-              <w:t>Lowered string: '</w:t>
+              <w:t>Lowered</w:t>
+            </w:r>
+            <w:proofErr w:type="spellEnd"/>
+            <w:r>
+              <w:rPr>
+                <w:rFonts w:ascii="Consolas" w:eastAsia="Times New Roman" w:hAnsi="Consolas" w:cs="Times New Roman"/>
+                <w:color w:val="CE9178"/>
+                <w:sz w:val="21"/>
+                <w:szCs w:val="21"/>
+              </w:rPr>
+              <w:t xml:space="preserve"> string: '</w:t>
             </w:r>
             <w:r>
               <w:rPr>
@@ -2045,6 +2615,7 @@
               </w:rPr>
               <w:t>{</w:t>
             </w:r>
+            <w:proofErr w:type="spellStart"/>
             <w:r>
               <w:rPr>
                 <w:rFonts w:ascii="Consolas" w:eastAsia="Times New Roman" w:hAnsi="Consolas" w:cs="Times New Roman"/>
@@ -2054,6 +2625,7 @@
               </w:rPr>
               <w:t>lowered_string</w:t>
             </w:r>
+            <w:proofErr w:type="spellEnd"/>
             <w:r>
               <w:rPr>
                 <w:rFonts w:ascii="Consolas" w:eastAsia="Times New Roman" w:hAnsi="Consolas" w:cs="Times New Roman"/>
@@ -2167,12 +2739,48 @@
           <w:lang w:val="ru-RU"/>
         </w:rPr>
       </w:pPr>
+      <w:proofErr w:type="spellStart"/>
       <w:r>
         <w:rPr>
           <w:lang w:val="ru-RU"/>
         </w:rPr>
         <w:lastRenderedPageBreak/>
-        <w:t xml:space="preserve">Обчислює дискримінант квадратного рівняння </w:t>
+        <w:t>Обчислює</w:t>
+      </w:r>
+      <w:proofErr w:type="spellEnd"/>
+      <w:r>
+        <w:rPr>
+          <w:lang w:val="ru-RU"/>
+        </w:rPr>
+        <w:t xml:space="preserve"> </w:t>
+      </w:r>
+      <w:proofErr w:type="spellStart"/>
+      <w:r>
+        <w:rPr>
+          <w:lang w:val="ru-RU"/>
+        </w:rPr>
+        <w:t>дискримінант</w:t>
+      </w:r>
+      <w:proofErr w:type="spellEnd"/>
+      <w:r>
+        <w:rPr>
+          <w:lang w:val="ru-RU"/>
+        </w:rPr>
+        <w:t xml:space="preserve"> квадратного </w:t>
+      </w:r>
+      <w:proofErr w:type="spellStart"/>
+      <w:r>
+        <w:rPr>
+          <w:lang w:val="ru-RU"/>
+        </w:rPr>
+        <w:t>рівняння</w:t>
+      </w:r>
+      <w:proofErr w:type="spellEnd"/>
+      <w:r>
+        <w:rPr>
+          <w:lang w:val="ru-RU"/>
+        </w:rPr>
+        <w:t xml:space="preserve"> </w:t>
       </w:r>
       <w:r>
         <w:t>ax</w:t>
@@ -2207,11 +2815,19 @@
         </w:rPr>
         <w:tab/>
       </w:r>
-      <w:r>
-        <w:rPr>
-          <w:lang w:val="ru-RU"/>
-        </w:rPr>
-        <w:t xml:space="preserve">Параметри: </w:t>
+      <w:proofErr w:type="spellStart"/>
+      <w:r>
+        <w:rPr>
+          <w:lang w:val="ru-RU"/>
+        </w:rPr>
+        <w:t>Параметри</w:t>
+      </w:r>
+      <w:proofErr w:type="spellEnd"/>
+      <w:r>
+        <w:rPr>
+          <w:lang w:val="ru-RU"/>
+        </w:rPr>
+        <w:t xml:space="preserve">: </w:t>
       </w:r>
     </w:p>
     <w:p>
@@ -2233,7 +2849,21 @@
         <w:rPr>
           <w:lang w:val="ru-RU"/>
         </w:rPr>
-        <w:t xml:space="preserve">: Коефіцієнт при </w:t>
+        <w:t xml:space="preserve">: </w:t>
+      </w:r>
+      <w:proofErr w:type="spellStart"/>
+      <w:r>
+        <w:rPr>
+          <w:lang w:val="ru-RU"/>
+        </w:rPr>
+        <w:t>Коефіцієнт</w:t>
+      </w:r>
+      <w:proofErr w:type="spellEnd"/>
+      <w:r>
+        <w:rPr>
+          <w:lang w:val="ru-RU"/>
+        </w:rPr>
+        <w:t xml:space="preserve"> при </w:t>
       </w:r>
       <w:r>
         <w:t>x</w:t>
@@ -2264,7 +2894,21 @@
         <w:rPr>
           <w:lang w:val="ru-RU"/>
         </w:rPr>
-        <w:t xml:space="preserve">: Коефіцієнт при </w:t>
+        <w:t xml:space="preserve">: </w:t>
+      </w:r>
+      <w:proofErr w:type="spellStart"/>
+      <w:r>
+        <w:rPr>
+          <w:lang w:val="ru-RU"/>
+        </w:rPr>
+        <w:t>Коефіцієнт</w:t>
+      </w:r>
+      <w:proofErr w:type="spellEnd"/>
+      <w:r>
+        <w:rPr>
+          <w:lang w:val="ru-RU"/>
+        </w:rPr>
+        <w:t xml:space="preserve"> при </w:t>
       </w:r>
       <w:r>
         <w:t>x</w:t>
@@ -2288,6 +2932,7 @@
         </w:rPr>
         <w:tab/>
       </w:r>
+      <w:proofErr w:type="gramStart"/>
       <w:r>
         <w:t>c</w:t>
       </w:r>
@@ -2295,15 +2940,37 @@
         <w:rPr>
           <w:lang w:val="ru-RU"/>
         </w:rPr>
-        <w:t xml:space="preserve"> : Вільний член</w:t>
-      </w:r>
-    </w:p>
-    <w:p>
-      <w:pPr>
-        <w:rPr>
-          <w:lang w:val="uk-UA"/>
-        </w:rPr>
-      </w:pPr>
+        <w:t xml:space="preserve"> :</w:t>
+      </w:r>
+      <w:proofErr w:type="gramEnd"/>
+      <w:r>
+        <w:rPr>
+          <w:lang w:val="ru-RU"/>
+        </w:rPr>
+        <w:t xml:space="preserve"> </w:t>
+      </w:r>
+      <w:proofErr w:type="spellStart"/>
+      <w:r>
+        <w:rPr>
+          <w:lang w:val="ru-RU"/>
+        </w:rPr>
+        <w:t>Вільний</w:t>
+      </w:r>
+      <w:proofErr w:type="spellEnd"/>
+      <w:r>
+        <w:rPr>
+          <w:lang w:val="ru-RU"/>
+        </w:rPr>
+        <w:t xml:space="preserve"> член</w:t>
+      </w:r>
+    </w:p>
+    <w:p>
+      <w:pPr>
+        <w:rPr>
+          <w:lang w:val="uk-UA"/>
+        </w:rPr>
+      </w:pPr>
+      <w:proofErr w:type="spellStart"/>
       <w:r>
         <w:rPr>
           <w:lang w:val="ru-RU"/>
@@ -2316,12 +2983,35 @@
         </w:rPr>
         <w:t>мо</w:t>
       </w:r>
-      <w:r>
-        <w:rPr>
-          <w:lang w:val="ru-RU"/>
-        </w:rPr>
-        <w:t>: Значення дискримінанту</w:t>
-      </w:r>
+      <w:proofErr w:type="spellEnd"/>
+      <w:r>
+        <w:rPr>
+          <w:lang w:val="ru-RU"/>
+        </w:rPr>
+        <w:t xml:space="preserve">: </w:t>
+      </w:r>
+      <w:proofErr w:type="spellStart"/>
+      <w:r>
+        <w:rPr>
+          <w:lang w:val="ru-RU"/>
+        </w:rPr>
+        <w:t>Значення</w:t>
+      </w:r>
+      <w:proofErr w:type="spellEnd"/>
+      <w:r>
+        <w:rPr>
+          <w:lang w:val="ru-RU"/>
+        </w:rPr>
+        <w:t xml:space="preserve"> </w:t>
+      </w:r>
+      <w:proofErr w:type="spellStart"/>
+      <w:r>
+        <w:rPr>
+          <w:lang w:val="ru-RU"/>
+        </w:rPr>
+        <w:t>дискримінанту</w:t>
+      </w:r>
+      <w:proofErr w:type="spellEnd"/>
     </w:p>
     <w:p>
       <w:pPr>
@@ -2382,6 +3072,7 @@
               </w:rPr>
               <w:t xml:space="preserve"> </w:t>
             </w:r>
+            <w:proofErr w:type="gramStart"/>
             <w:r>
               <w:rPr>
                 <w:rFonts w:ascii="Consolas" w:eastAsia="Times New Roman" w:hAnsi="Consolas" w:cs="Times New Roman"/>
@@ -2400,6 +3091,7 @@
               </w:rPr>
               <w:t>(</w:t>
             </w:r>
+            <w:proofErr w:type="gramEnd"/>
             <w:r>
               <w:rPr>
                 <w:rFonts w:ascii="Consolas" w:eastAsia="Times New Roman" w:hAnsi="Consolas" w:cs="Times New Roman"/>
@@ -2858,6 +3550,7 @@
               </w:rPr>
               <w:t xml:space="preserve"> </w:t>
             </w:r>
+            <w:proofErr w:type="gramStart"/>
             <w:r>
               <w:rPr>
                 <w:rFonts w:ascii="Consolas" w:eastAsia="Times New Roman" w:hAnsi="Consolas" w:cs="Times New Roman"/>
@@ -2876,6 +3569,7 @@
               </w:rPr>
               <w:t>(</w:t>
             </w:r>
+            <w:proofErr w:type="gramEnd"/>
             <w:r>
               <w:rPr>
                 <w:rFonts w:ascii="Consolas" w:eastAsia="Times New Roman" w:hAnsi="Consolas" w:cs="Times New Roman"/>
@@ -2944,6 +3638,7 @@
                 <w:szCs w:val="21"/>
               </w:rPr>
             </w:pPr>
+            <w:proofErr w:type="gramStart"/>
             <w:r>
               <w:rPr>
                 <w:rFonts w:ascii="Consolas" w:eastAsia="Times New Roman" w:hAnsi="Consolas" w:cs="Times New Roman"/>
@@ -2962,6 +3657,8 @@
               </w:rPr>
               <w:t>(</w:t>
             </w:r>
+            <w:proofErr w:type="spellStart"/>
+            <w:proofErr w:type="gramEnd"/>
             <w:r>
               <w:rPr>
                 <w:rFonts w:ascii="Consolas" w:eastAsia="Times New Roman" w:hAnsi="Consolas" w:cs="Times New Roman"/>
@@ -2978,7 +3675,17 @@
                 <w:sz w:val="21"/>
                 <w:szCs w:val="21"/>
               </w:rPr>
-              <w:t xml:space="preserve">"Дискримінант: </w:t>
+              <w:t>"Дискримінант</w:t>
+            </w:r>
+            <w:proofErr w:type="spellEnd"/>
+            <w:r>
+              <w:rPr>
+                <w:rFonts w:ascii="Consolas" w:eastAsia="Times New Roman" w:hAnsi="Consolas" w:cs="Times New Roman"/>
+                <w:color w:val="CE9178"/>
+                <w:sz w:val="21"/>
+                <w:szCs w:val="21"/>
+              </w:rPr>
+              <w:t xml:space="preserve">: </w:t>
             </w:r>
             <w:r>
               <w:rPr>
@@ -3583,7 +4290,161 @@
           <w:lang w:val="uk-UA"/>
         </w:rPr>
         <w:lastRenderedPageBreak/>
-        <w:t>Написати програму тестування функцій списків таких як: extend(), append(), insert(id, val), remove(val), clear(), sort(), reverse(), copy()</w:t>
+        <w:t xml:space="preserve">Написати програму тестування функцій списків таких як: </w:t>
+      </w:r>
+      <w:proofErr w:type="spellStart"/>
+      <w:r>
+        <w:rPr>
+          <w:lang w:val="uk-UA"/>
+        </w:rPr>
+        <w:t>extend</w:t>
+      </w:r>
+      <w:proofErr w:type="spellEnd"/>
+      <w:r>
+        <w:rPr>
+          <w:lang w:val="uk-UA"/>
+        </w:rPr>
+        <w:t xml:space="preserve">(), </w:t>
+      </w:r>
+      <w:proofErr w:type="spellStart"/>
+      <w:r>
+        <w:rPr>
+          <w:lang w:val="uk-UA"/>
+        </w:rPr>
+        <w:t>append</w:t>
+      </w:r>
+      <w:proofErr w:type="spellEnd"/>
+      <w:r>
+        <w:rPr>
+          <w:lang w:val="uk-UA"/>
+        </w:rPr>
+        <w:t xml:space="preserve">(), </w:t>
+      </w:r>
+      <w:proofErr w:type="spellStart"/>
+      <w:r>
+        <w:rPr>
+          <w:lang w:val="uk-UA"/>
+        </w:rPr>
+        <w:t>insert</w:t>
+      </w:r>
+      <w:proofErr w:type="spellEnd"/>
+      <w:r>
+        <w:rPr>
+          <w:lang w:val="uk-UA"/>
+        </w:rPr>
+        <w:t>(</w:t>
+      </w:r>
+      <w:proofErr w:type="spellStart"/>
+      <w:r>
+        <w:rPr>
+          <w:lang w:val="uk-UA"/>
+        </w:rPr>
+        <w:t>id</w:t>
+      </w:r>
+      <w:proofErr w:type="spellEnd"/>
+      <w:r>
+        <w:rPr>
+          <w:lang w:val="uk-UA"/>
+        </w:rPr>
+        <w:t xml:space="preserve">, </w:t>
+      </w:r>
+      <w:proofErr w:type="spellStart"/>
+      <w:r>
+        <w:rPr>
+          <w:lang w:val="uk-UA"/>
+        </w:rPr>
+        <w:t>val</w:t>
+      </w:r>
+      <w:proofErr w:type="spellEnd"/>
+      <w:r>
+        <w:rPr>
+          <w:lang w:val="uk-UA"/>
+        </w:rPr>
+        <w:t xml:space="preserve">), </w:t>
+      </w:r>
+      <w:proofErr w:type="spellStart"/>
+      <w:r>
+        <w:rPr>
+          <w:lang w:val="uk-UA"/>
+        </w:rPr>
+        <w:t>remove</w:t>
+      </w:r>
+      <w:proofErr w:type="spellEnd"/>
+      <w:r>
+        <w:rPr>
+          <w:lang w:val="uk-UA"/>
+        </w:rPr>
+        <w:t>(</w:t>
+      </w:r>
+      <w:proofErr w:type="spellStart"/>
+      <w:r>
+        <w:rPr>
+          <w:lang w:val="uk-UA"/>
+        </w:rPr>
+        <w:t>val</w:t>
+      </w:r>
+      <w:proofErr w:type="spellEnd"/>
+      <w:r>
+        <w:rPr>
+          <w:lang w:val="uk-UA"/>
+        </w:rPr>
+        <w:t xml:space="preserve">), </w:t>
+      </w:r>
+      <w:proofErr w:type="spellStart"/>
+      <w:r>
+        <w:rPr>
+          <w:lang w:val="uk-UA"/>
+        </w:rPr>
+        <w:t>clear</w:t>
+      </w:r>
+      <w:proofErr w:type="spellEnd"/>
+      <w:r>
+        <w:rPr>
+          <w:lang w:val="uk-UA"/>
+        </w:rPr>
+        <w:t xml:space="preserve">(), </w:t>
+      </w:r>
+      <w:proofErr w:type="spellStart"/>
+      <w:r>
+        <w:rPr>
+          <w:lang w:val="uk-UA"/>
+        </w:rPr>
+        <w:t>sort</w:t>
+      </w:r>
+      <w:proofErr w:type="spellEnd"/>
+      <w:r>
+        <w:rPr>
+          <w:lang w:val="uk-UA"/>
+        </w:rPr>
+        <w:t xml:space="preserve">(), </w:t>
+      </w:r>
+      <w:proofErr w:type="spellStart"/>
+      <w:r>
+        <w:rPr>
+          <w:lang w:val="uk-UA"/>
+        </w:rPr>
+        <w:t>reverse</w:t>
+      </w:r>
+      <w:proofErr w:type="spellEnd"/>
+      <w:r>
+        <w:rPr>
+          <w:lang w:val="uk-UA"/>
+        </w:rPr>
+        <w:t xml:space="preserve">(), </w:t>
+      </w:r>
+      <w:proofErr w:type="spellStart"/>
+      <w:r>
+        <w:rPr>
+          <w:lang w:val="uk-UA"/>
+        </w:rPr>
+        <w:t>copy</w:t>
+      </w:r>
+      <w:proofErr w:type="spellEnd"/>
+      <w:r>
+        <w:rPr>
+          <w:lang w:val="uk-UA"/>
+        </w:rPr>
+        <w:t>()</w:t>
       </w:r>
     </w:p>
     <w:p>
@@ -3646,7 +4507,91 @@
           <w:lang w:val="uk-UA"/>
         </w:rPr>
         <w:lastRenderedPageBreak/>
-        <w:t>Написати програму тестування функцій словників таких як: update(), del(), clear(), keys(), values(), items()</w:t>
+        <w:t xml:space="preserve">Написати програму тестування функцій словників таких як: </w:t>
+      </w:r>
+      <w:proofErr w:type="spellStart"/>
+      <w:r>
+        <w:rPr>
+          <w:lang w:val="uk-UA"/>
+        </w:rPr>
+        <w:t>update</w:t>
+      </w:r>
+      <w:proofErr w:type="spellEnd"/>
+      <w:r>
+        <w:rPr>
+          <w:lang w:val="uk-UA"/>
+        </w:rPr>
+        <w:t xml:space="preserve">(), </w:t>
+      </w:r>
+      <w:proofErr w:type="spellStart"/>
+      <w:r>
+        <w:rPr>
+          <w:lang w:val="uk-UA"/>
+        </w:rPr>
+        <w:t>del</w:t>
+      </w:r>
+      <w:proofErr w:type="spellEnd"/>
+      <w:r>
+        <w:rPr>
+          <w:lang w:val="uk-UA"/>
+        </w:rPr>
+        <w:t xml:space="preserve">(), </w:t>
+      </w:r>
+      <w:proofErr w:type="spellStart"/>
+      <w:r>
+        <w:rPr>
+          <w:lang w:val="uk-UA"/>
+        </w:rPr>
+        <w:t>clear</w:t>
+      </w:r>
+      <w:proofErr w:type="spellEnd"/>
+      <w:r>
+        <w:rPr>
+          <w:lang w:val="uk-UA"/>
+        </w:rPr>
+        <w:t xml:space="preserve">(), </w:t>
+      </w:r>
+      <w:proofErr w:type="spellStart"/>
+      <w:r>
+        <w:rPr>
+          <w:lang w:val="uk-UA"/>
+        </w:rPr>
+        <w:t>keys</w:t>
+      </w:r>
+      <w:proofErr w:type="spellEnd"/>
+      <w:r>
+        <w:rPr>
+          <w:lang w:val="uk-UA"/>
+        </w:rPr>
+        <w:t xml:space="preserve">(), </w:t>
+      </w:r>
+      <w:proofErr w:type="spellStart"/>
+      <w:r>
+        <w:rPr>
+          <w:lang w:val="uk-UA"/>
+        </w:rPr>
+        <w:t>values</w:t>
+      </w:r>
+      <w:proofErr w:type="spellEnd"/>
+      <w:r>
+        <w:rPr>
+          <w:lang w:val="uk-UA"/>
+        </w:rPr>
+        <w:t xml:space="preserve">(), </w:t>
+      </w:r>
+      <w:proofErr w:type="spellStart"/>
+      <w:r>
+        <w:rPr>
+          <w:lang w:val="uk-UA"/>
+        </w:rPr>
+        <w:t>items</w:t>
+      </w:r>
+      <w:proofErr w:type="spellEnd"/>
+      <w:r>
+        <w:rPr>
+          <w:lang w:val="uk-UA"/>
+        </w:rPr>
+        <w:t>()</w:t>
       </w:r>
     </w:p>
     <w:p>
@@ -4140,7 +5085,49 @@
         <w:rPr>
           <w:lang w:val="uk-UA"/>
         </w:rPr>
-        <w:t xml:space="preserve">Гра з комп’ютером: камінь, ножиці, папір. Програма виконує запит від користувача на введення одного із значень ["stone", "scissor", "paper"]. Наступним кроком, використовуючи модуль </w:t>
+        <w:t>Гра з комп’ютером: камінь, ножиці, папір. Програма виконує запит від користувача на введення одного із значень ["</w:t>
+      </w:r>
+      <w:proofErr w:type="spellStart"/>
+      <w:r>
+        <w:rPr>
+          <w:lang w:val="uk-UA"/>
+        </w:rPr>
+        <w:t>stone</w:t>
+      </w:r>
+      <w:proofErr w:type="spellEnd"/>
+      <w:r>
+        <w:rPr>
+          <w:lang w:val="uk-UA"/>
+        </w:rPr>
+        <w:t>", "</w:t>
+      </w:r>
+      <w:proofErr w:type="spellStart"/>
+      <w:r>
+        <w:rPr>
+          <w:lang w:val="uk-UA"/>
+        </w:rPr>
+        <w:t>scissor</w:t>
+      </w:r>
+      <w:proofErr w:type="spellEnd"/>
+      <w:r>
+        <w:rPr>
+          <w:lang w:val="uk-UA"/>
+        </w:rPr>
+        <w:t>", "</w:t>
+      </w:r>
+      <w:proofErr w:type="spellStart"/>
+      <w:r>
+        <w:rPr>
+          <w:lang w:val="uk-UA"/>
+        </w:rPr>
+        <w:t>paper</w:t>
+      </w:r>
+      <w:proofErr w:type="spellEnd"/>
+      <w:r>
+        <w:rPr>
+          <w:lang w:val="uk-UA"/>
+        </w:rPr>
+        <w:t xml:space="preserve">"]. Наступним кроком, використовуючи модуль </w:t>
       </w:r>
       <w:r>
         <w:t>random</w:t>
@@ -4161,7 +5148,49 @@
         <w:rPr>
           <w:lang w:val="uk-UA"/>
         </w:rPr>
-        <w:t>програма у випадковому порядку вибирає одне із значень ["stone", "scissor", "paper"]. В залежності від умови, що камінь перемагає ножиці, ножиці перемагають папір, а папір перемагає камінь визначити переможця.</w:t>
+        <w:t>програма у випадковому порядку вибирає одне із значень ["</w:t>
+      </w:r>
+      <w:proofErr w:type="spellStart"/>
+      <w:r>
+        <w:rPr>
+          <w:lang w:val="uk-UA"/>
+        </w:rPr>
+        <w:t>stone</w:t>
+      </w:r>
+      <w:proofErr w:type="spellEnd"/>
+      <w:r>
+        <w:rPr>
+          <w:lang w:val="uk-UA"/>
+        </w:rPr>
+        <w:t>", "</w:t>
+      </w:r>
+      <w:proofErr w:type="spellStart"/>
+      <w:r>
+        <w:rPr>
+          <w:lang w:val="uk-UA"/>
+        </w:rPr>
+        <w:t>scissor</w:t>
+      </w:r>
+      <w:proofErr w:type="spellEnd"/>
+      <w:r>
+        <w:rPr>
+          <w:lang w:val="uk-UA"/>
+        </w:rPr>
+        <w:t>", "</w:t>
+      </w:r>
+      <w:proofErr w:type="spellStart"/>
+      <w:r>
+        <w:rPr>
+          <w:lang w:val="uk-UA"/>
+        </w:rPr>
+        <w:t>paper</w:t>
+      </w:r>
+      <w:proofErr w:type="spellEnd"/>
+      <w:r>
+        <w:rPr>
+          <w:lang w:val="uk-UA"/>
+        </w:rPr>
+        <w:t>"]. В залежності від умови, що камінь перемагає ножиці, ножиці перемагають папір, а папір перемагає камінь визначити переможця.</w:t>
       </w:r>
     </w:p>
     <w:p>
@@ -4251,7 +5280,21 @@
           <w:lang w:val="uk-UA"/>
         </w:rPr>
         <w:lastRenderedPageBreak/>
-        <w:t xml:space="preserve">сервісів requests. Достатня умова роботи – можливість конвертації для трьох іноземних валют </w:t>
+        <w:t xml:space="preserve">сервісів </w:t>
+      </w:r>
+      <w:proofErr w:type="spellStart"/>
+      <w:r>
+        <w:rPr>
+          <w:lang w:val="uk-UA"/>
+        </w:rPr>
+        <w:t>requests</w:t>
+      </w:r>
+      <w:proofErr w:type="spellEnd"/>
+      <w:r>
+        <w:rPr>
+          <w:lang w:val="uk-UA"/>
+        </w:rPr>
+        <w:t xml:space="preserve">. Достатня умова роботи – можливість конвертації для трьох іноземних валют </w:t>
       </w:r>
       <w:r>
         <w:t>EUR</w:t>
@@ -4713,7 +5756,21 @@
         <w:rPr>
           <w:lang w:val="uk-UA"/>
         </w:rPr>
-        <w:t>Розробити механізм логування всіх дій, що виконує програма. Забезпечити зберігання інформації про введені данні, виконану операцію та результат виконання операції над даними.</w:t>
+        <w:t xml:space="preserve">Розробити механізм </w:t>
+      </w:r>
+      <w:proofErr w:type="spellStart"/>
+      <w:r>
+        <w:rPr>
+          <w:lang w:val="uk-UA"/>
+        </w:rPr>
+        <w:t>логування</w:t>
+      </w:r>
+      <w:proofErr w:type="spellEnd"/>
+      <w:r>
+        <w:rPr>
+          <w:lang w:val="uk-UA"/>
+        </w:rPr>
+        <w:t xml:space="preserve"> всіх дій, що виконує програма. Забезпечити зберігання інформації про введені данні, виконану операцію та результат виконання операції над даними.</w:t>
       </w:r>
     </w:p>
     <w:p>
@@ -4850,6 +5907,7 @@
         </w:rPr>
         <w:t xml:space="preserve">функції </w:t>
       </w:r>
+      <w:proofErr w:type="gramStart"/>
       <w:r>
         <w:t>sorted</w:t>
       </w:r>
@@ -4857,7 +5915,14 @@
         <w:rPr>
           <w:lang w:val="ru-RU"/>
         </w:rPr>
-        <w:t xml:space="preserve">() </w:t>
+        <w:t>(</w:t>
+      </w:r>
+      <w:proofErr w:type="gramEnd"/>
+      <w:r>
+        <w:rPr>
+          <w:lang w:val="ru-RU"/>
+        </w:rPr>
+        <w:t xml:space="preserve">) </w:t>
       </w:r>
       <w:r>
         <w:rPr>
@@ -4937,6 +6002,8 @@
           <w:lang w:val="uk-UA"/>
         </w:rPr>
       </w:pPr>
+      <w:bookmarkStart w:id="0" w:name="_GoBack"/>
+      <w:bookmarkEnd w:id="0"/>
     </w:p>
     <w:p>
       <w:pPr>
@@ -5030,9 +6097,11 @@
         </w:rPr>
         <w:t>Ознайомитись з існуючими за замовченням методами класу по типу __</w:t>
       </w:r>
+      <w:proofErr w:type="spellStart"/>
       <w:r>
         <w:t>init</w:t>
       </w:r>
+      <w:proofErr w:type="spellEnd"/>
       <w:r>
         <w:rPr>
           <w:lang w:val="ru-RU"/>
@@ -5532,206 +6601,114 @@
     </w:p>
     <w:p>
       <w:pPr>
-        <w:pStyle w:val="a6"/>
+        <w:spacing w:line="259" w:lineRule="auto"/>
         <w:ind w:firstLine="0"/>
-        <w:rPr>
-          <w:lang w:val="uk-UA"/>
-        </w:rPr>
-      </w:pPr>
-    </w:p>
-    <w:p>
-      <w:pPr>
-        <w:jc w:val="right"/>
-        <w:rPr>
-          <w:lang w:val="ru-RU"/>
-        </w:rPr>
-      </w:pPr>
-      <w:r>
-        <w:rPr>
-          <w:lang w:val="uk-UA"/>
-        </w:rPr>
-        <w:t>Звіт до Лабораторної роботи №</w:t>
-      </w:r>
-      <w:r>
-        <w:rPr>
-          <w:lang w:val="ru-RU"/>
-        </w:rPr>
-        <w:t>1</w:t>
-      </w:r>
-    </w:p>
-    <w:p>
-      <w:pPr>
-        <w:rPr>
-          <w:lang w:val="uk-UA"/>
-        </w:rPr>
-      </w:pPr>
-      <w:r>
-        <w:rPr>
-          <w:lang w:val="uk-UA"/>
-        </w:rPr>
-        <w:t>Під час виконання Лабораторної роботи №</w:t>
-      </w:r>
-      <w:r>
-        <w:rPr>
-          <w:lang w:val="ru-RU"/>
-        </w:rPr>
-        <w:t>1</w:t>
-      </w:r>
-      <w:r>
-        <w:rPr>
-          <w:lang w:val="uk-UA"/>
-        </w:rPr>
-        <w:t xml:space="preserve"> було надано варіанти рішення до наступних задач:</w:t>
-      </w:r>
-    </w:p>
-    <w:p>
-      <w:pPr>
-        <w:pStyle w:val="a6"/>
-        <w:numPr>
-          <w:ilvl w:val="0"/>
-          <w:numId w:val="9"/>
-        </w:numPr>
-        <w:rPr>
-          <w:lang w:val="ru-RU"/>
-        </w:rPr>
-      </w:pPr>
-      <w:r>
-        <w:rPr>
-          <w:lang w:val="ru-RU"/>
-        </w:rPr>
-        <w:t>Необхідно розширити відомості про студента до 4х полів. На даний час використовується лише два поля (</w:t>
-      </w:r>
-      <w:r>
-        <w:t>name</w:t>
-      </w:r>
-      <w:r>
-        <w:rPr>
-          <w:lang w:val="ru-RU"/>
-        </w:rPr>
-        <w:t xml:space="preserve"> та </w:t>
-      </w:r>
-      <w:r>
-        <w:t>phone</w:t>
-      </w:r>
-      <w:r>
-        <w:rPr>
-          <w:lang w:val="ru-RU"/>
-        </w:rPr>
-        <w:t>).</w:t>
-      </w:r>
-    </w:p>
-    <w:p>
-      <w:pPr>
-        <w:pStyle w:val="a6"/>
-        <w:ind w:left="1080" w:firstLine="0"/>
-        <w:rPr>
-          <w:lang w:val="ru-RU"/>
-        </w:rPr>
-      </w:pPr>
-      <w:r>
-        <w:rPr>
-          <w:lang w:val="ru-RU"/>
-        </w:rPr>
-        <w:t>Необхідно переробити існуючий функціонал враховуючи розширення відомості про студента до 4х полів.</w:t>
-      </w:r>
-    </w:p>
-    <w:p>
-      <w:pPr>
-        <w:ind w:left="720" w:firstLine="0"/>
-        <w:rPr>
-          <w:lang w:val="uk-UA"/>
-        </w:rPr>
-      </w:pPr>
-      <w:r>
-        <w:rPr>
-          <w:lang w:val="ru-RU"/>
-        </w:rPr>
-        <w:lastRenderedPageBreak/>
-        <w:t xml:space="preserve">Необхідно реалізувати з нуля функціонал зміни інформації про студента враховуючи той факт, що вже існує реалізація додавання нового запису та видалення існуючого. </w:t>
-      </w:r>
-      <w:r>
-        <w:rPr>
-          <w:b/>
-          <w:bCs/>
-          <w:lang w:val="ru-RU"/>
-        </w:rPr>
-        <w:t>При зміні інформації про студента список має залишатись відсортованим</w:t>
-      </w:r>
-      <w:r>
-        <w:rPr>
-          <w:lang w:val="ru-RU"/>
-        </w:rPr>
-        <w:t>.</w:t>
-      </w:r>
-    </w:p>
-    <w:p>
-      <w:pPr>
-        <w:pStyle w:val="a6"/>
-        <w:ind w:left="1080" w:firstLine="0"/>
-        <w:rPr>
-          <w:lang w:val="uk-UA"/>
+        <w:jc w:val="left"/>
+        <w:rPr>
+          <w:lang w:val="ru-RU"/>
+        </w:rPr>
+      </w:pPr>
+      <w:r>
+        <w:rPr>
+          <w:lang w:val="ru-RU"/>
+        </w:rPr>
+        <w:br w:type="page"/>
+      </w:r>
+    </w:p>
+    <w:p>
+      <w:pPr>
+        <w:rPr>
+          <w:lang w:val="ru-RU"/>
+        </w:rPr>
+      </w:pPr>
+    </w:p>
+    <w:p>
+      <w:pPr>
+        <w:rPr>
+          <w:lang w:val="uk-UA"/>
+        </w:rPr>
+      </w:pPr>
+    </w:p>
+    <w:p>
+      <w:pPr>
+        <w:rPr>
+          <w:lang w:val="ru-RU"/>
+        </w:rPr>
+      </w:pPr>
+      <w:r>
+        <w:rPr>
+          <w:lang w:val="uk-UA"/>
+        </w:rPr>
+        <w:t xml:space="preserve">Посилання на </w:t>
+      </w:r>
+      <w:proofErr w:type="spellStart"/>
+      <w:r>
+        <w:t>github</w:t>
+      </w:r>
+      <w:proofErr w:type="spellEnd"/>
+      <w:r>
+        <w:rPr>
+          <w:lang w:val="ru-RU"/>
+        </w:rPr>
+        <w:t>:</w:t>
+      </w:r>
+    </w:p>
+    <w:p>
+      <w:pPr>
+        <w:rPr>
+          <w:lang w:val="ru-RU"/>
+        </w:rPr>
+      </w:pPr>
+      <w:hyperlink r:id="rId32" w:history="1">
+        <w:r>
+          <w:rPr>
+            <w:rStyle w:val="a4"/>
+            <w:lang w:val="ru-RU"/>
+          </w:rPr>
+          <w:t>https://github.com/RickWazowski98/TP-KB-231-Viacheslav-Saievskyi</w:t>
+        </w:r>
+      </w:hyperlink>
+    </w:p>
+    <w:p>
+      <w:pPr>
+        <w:rPr>
+          <w:lang w:val="ru-RU"/>
+        </w:rPr>
+      </w:pPr>
+      <w:r>
+        <w:rPr>
+          <w:lang w:val="uk-UA"/>
+        </w:rPr>
+        <w:t xml:space="preserve">Знімок екрану з посилання на </w:t>
+      </w:r>
+      <w:proofErr w:type="spellStart"/>
+      <w:r>
+        <w:t>github</w:t>
+      </w:r>
+      <w:proofErr w:type="spellEnd"/>
+      <w:r>
+        <w:rPr>
+          <w:lang w:val="ru-RU"/>
+        </w:rPr>
+        <w:t>:</w:t>
+      </w:r>
+    </w:p>
+    <w:p>
+      <w:pPr>
+        <w:rPr>
+          <w:lang w:val="ru-RU"/>
         </w:rPr>
       </w:pPr>
       <w:r>
         <w:rPr>
           <w:noProof/>
-          <w:lang w:val="uk-UA"/>
+          <w:lang w:val="ru-RU"/>
         </w:rPr>
         <w:drawing>
-          <wp:inline distT="0" distB="0" distL="0" distR="0" wp14:anchorId="1EB9FFAA" wp14:editId="63B079BB">
-            <wp:extent cx="5943600" cy="3740785"/>
+          <wp:inline distT="0" distB="0" distL="0" distR="0" wp14:anchorId="1E7679AF" wp14:editId="1920E07E">
+            <wp:extent cx="5943600" cy="4288790"/>
             <wp:effectExtent l="0" t="0" r="0" b="0"/>
-            <wp:docPr id="34" name="Рисунок 34"/>
-            <wp:cNvGraphicFramePr>
-              <a:graphicFrameLocks xmlns:a="http://schemas.openxmlformats.org/drawingml/2006/main" noChangeAspect="1"/>
-            </wp:cNvGraphicFramePr>
-            <a:graphic xmlns:a="http://schemas.openxmlformats.org/drawingml/2006/main">
-              <a:graphicData uri="http://schemas.openxmlformats.org/drawingml/2006/picture">
-                <pic:pic xmlns:pic="http://schemas.openxmlformats.org/drawingml/2006/picture">
-                  <pic:nvPicPr>
-                    <pic:cNvPr id="1" name=""/>
-                    <pic:cNvPicPr/>
-                  </pic:nvPicPr>
-                  <pic:blipFill>
-                    <a:blip r:embed="rId32"/>
-                    <a:stretch>
-                      <a:fillRect/>
-                    </a:stretch>
-                  </pic:blipFill>
-                  <pic:spPr>
-                    <a:xfrm>
-                      <a:off x="0" y="0"/>
-                      <a:ext cx="5943600" cy="3740785"/>
-                    </a:xfrm>
-                    <a:prstGeom prst="rect">
-                      <a:avLst/>
-                    </a:prstGeom>
-                  </pic:spPr>
-                </pic:pic>
-              </a:graphicData>
-            </a:graphic>
-          </wp:inline>
-        </w:drawing>
-      </w:r>
-    </w:p>
-    <w:p>
-      <w:pPr>
-        <w:pStyle w:val="a6"/>
-        <w:ind w:left="1080" w:firstLine="0"/>
-        <w:rPr>
-          <w:lang w:val="uk-UA"/>
-        </w:rPr>
-      </w:pPr>
-      <w:r>
-        <w:rPr>
-          <w:noProof/>
-          <w:lang w:val="uk-UA"/>
-        </w:rPr>
-        <w:drawing>
-          <wp:inline distT="0" distB="0" distL="0" distR="0" wp14:anchorId="57245557" wp14:editId="27EAC725">
-            <wp:extent cx="5277587" cy="2695951"/>
-            <wp:effectExtent l="0" t="0" r="0" b="9525"/>
-            <wp:docPr id="35" name="Рисунок 35"/>
+            <wp:docPr id="10" name="Рисунок 10"/>
             <wp:cNvGraphicFramePr>
               <a:graphicFrameLocks xmlns:a="http://schemas.openxmlformats.org/drawingml/2006/main" noChangeAspect="1"/>
             </wp:cNvGraphicFramePr>
@@ -5751,1333 +6728,6 @@
                   <pic:spPr>
                     <a:xfrm>
                       <a:off x="0" y="0"/>
-                      <a:ext cx="5277587" cy="2695951"/>
-                    </a:xfrm>
-                    <a:prstGeom prst="rect">
-                      <a:avLst/>
-                    </a:prstGeom>
-                  </pic:spPr>
-                </pic:pic>
-              </a:graphicData>
-            </a:graphic>
-          </wp:inline>
-        </w:drawing>
-      </w:r>
-    </w:p>
-    <w:p>
-      <w:pPr>
-        <w:pStyle w:val="a6"/>
-        <w:ind w:left="1080" w:firstLine="0"/>
-        <w:rPr>
-          <w:lang w:val="uk-UA"/>
-        </w:rPr>
-      </w:pPr>
-      <w:r>
-        <w:rPr>
-          <w:noProof/>
-          <w:lang w:val="uk-UA"/>
-        </w:rPr>
-        <w:lastRenderedPageBreak/>
-        <w:drawing>
-          <wp:inline distT="0" distB="0" distL="0" distR="0" wp14:anchorId="54D0F4A6" wp14:editId="1F95469A">
-            <wp:extent cx="5943600" cy="4086860"/>
-            <wp:effectExtent l="0" t="0" r="0" b="8890"/>
-            <wp:docPr id="36" name="Рисунок 36"/>
-            <wp:cNvGraphicFramePr>
-              <a:graphicFrameLocks xmlns:a="http://schemas.openxmlformats.org/drawingml/2006/main" noChangeAspect="1"/>
-            </wp:cNvGraphicFramePr>
-            <a:graphic xmlns:a="http://schemas.openxmlformats.org/drawingml/2006/main">
-              <a:graphicData uri="http://schemas.openxmlformats.org/drawingml/2006/picture">
-                <pic:pic xmlns:pic="http://schemas.openxmlformats.org/drawingml/2006/picture">
-                  <pic:nvPicPr>
-                    <pic:cNvPr id="1" name=""/>
-                    <pic:cNvPicPr/>
-                  </pic:nvPicPr>
-                  <pic:blipFill>
-                    <a:blip r:embed="rId34"/>
-                    <a:stretch>
-                      <a:fillRect/>
-                    </a:stretch>
-                  </pic:blipFill>
-                  <pic:spPr>
-                    <a:xfrm>
-                      <a:off x="0" y="0"/>
-                      <a:ext cx="5943600" cy="4086860"/>
-                    </a:xfrm>
-                    <a:prstGeom prst="rect">
-                      <a:avLst/>
-                    </a:prstGeom>
-                  </pic:spPr>
-                </pic:pic>
-              </a:graphicData>
-            </a:graphic>
-          </wp:inline>
-        </w:drawing>
-      </w:r>
-    </w:p>
-    <w:p>
-      <w:pPr>
-        <w:rPr>
-          <w:lang w:val="uk-UA"/>
-        </w:rPr>
-      </w:pPr>
-      <w:r>
-        <w:rPr>
-          <w:noProof/>
-          <w:lang w:val="uk-UA"/>
-        </w:rPr>
-        <w:drawing>
-          <wp:inline distT="0" distB="0" distL="0" distR="0" wp14:anchorId="4B93439F" wp14:editId="6BBBDE25">
-            <wp:extent cx="5943600" cy="3145790"/>
-            <wp:effectExtent l="0" t="0" r="0" b="0"/>
-            <wp:docPr id="37" name="Рисунок 37"/>
-            <wp:cNvGraphicFramePr>
-              <a:graphicFrameLocks xmlns:a="http://schemas.openxmlformats.org/drawingml/2006/main" noChangeAspect="1"/>
-            </wp:cNvGraphicFramePr>
-            <a:graphic xmlns:a="http://schemas.openxmlformats.org/drawingml/2006/main">
-              <a:graphicData uri="http://schemas.openxmlformats.org/drawingml/2006/picture">
-                <pic:pic xmlns:pic="http://schemas.openxmlformats.org/drawingml/2006/picture">
-                  <pic:nvPicPr>
-                    <pic:cNvPr id="1" name=""/>
-                    <pic:cNvPicPr/>
-                  </pic:nvPicPr>
-                  <pic:blipFill>
-                    <a:blip r:embed="rId35"/>
-                    <a:stretch>
-                      <a:fillRect/>
-                    </a:stretch>
-                  </pic:blipFill>
-                  <pic:spPr>
-                    <a:xfrm>
-                      <a:off x="0" y="0"/>
-                      <a:ext cx="5943600" cy="3145790"/>
-                    </a:xfrm>
-                    <a:prstGeom prst="rect">
-                      <a:avLst/>
-                    </a:prstGeom>
-                  </pic:spPr>
-                </pic:pic>
-              </a:graphicData>
-            </a:graphic>
-          </wp:inline>
-        </w:drawing>
-      </w:r>
-    </w:p>
-    <w:p>
-      <w:pPr>
-        <w:spacing w:line="259" w:lineRule="auto"/>
-        <w:ind w:firstLine="0"/>
-        <w:jc w:val="left"/>
-        <w:rPr>
-          <w:lang w:val="uk-UA"/>
-        </w:rPr>
-      </w:pPr>
-      <w:r>
-        <w:rPr>
-          <w:lang w:val="uk-UA"/>
-        </w:rPr>
-        <w:br w:type="page"/>
-      </w:r>
-    </w:p>
-    <w:p>
-      <w:pPr>
-        <w:rPr>
-          <w:lang w:val="uk-UA"/>
-        </w:rPr>
-      </w:pPr>
-    </w:p>
-    <w:p>
-      <w:pPr>
-        <w:jc w:val="right"/>
-        <w:rPr>
-          <w:lang w:val="ru-RU"/>
-        </w:rPr>
-      </w:pPr>
-      <w:r>
-        <w:rPr>
-          <w:lang w:val="uk-UA"/>
-        </w:rPr>
-        <w:t>Звіт до Лабораторної роботи №</w:t>
-      </w:r>
-      <w:r>
-        <w:rPr>
-          <w:lang w:val="ru-RU"/>
-        </w:rPr>
-        <w:t>2</w:t>
-      </w:r>
-    </w:p>
-    <w:p>
-      <w:pPr>
-        <w:rPr>
-          <w:lang w:val="uk-UA"/>
-        </w:rPr>
-      </w:pPr>
-      <w:r>
-        <w:rPr>
-          <w:lang w:val="uk-UA"/>
-        </w:rPr>
-        <w:t>Під час виконання Лабораторної роботи №</w:t>
-      </w:r>
-      <w:r>
-        <w:rPr>
-          <w:lang w:val="ru-RU"/>
-        </w:rPr>
-        <w:t>2</w:t>
-      </w:r>
-      <w:r>
-        <w:rPr>
-          <w:lang w:val="uk-UA"/>
-        </w:rPr>
-        <w:t xml:space="preserve"> було надано варіанти рішення до наступних задач:</w:t>
-      </w:r>
-    </w:p>
-    <w:p>
-      <w:pPr>
-        <w:pStyle w:val="a6"/>
-        <w:numPr>
-          <w:ilvl w:val="0"/>
-          <w:numId w:val="10"/>
-        </w:numPr>
-        <w:rPr>
-          <w:lang w:val="ru-RU"/>
-        </w:rPr>
-      </w:pPr>
-      <w:r>
-        <w:rPr>
-          <w:b/>
-          <w:bCs/>
-          <w:lang w:val="ru-RU"/>
-        </w:rPr>
-        <w:t>завантаження</w:t>
-      </w:r>
-      <w:r>
-        <w:rPr>
-          <w:lang w:val="ru-RU"/>
-        </w:rPr>
-        <w:t xml:space="preserve"> початкових данні для довідника з </w:t>
-      </w:r>
-      <w:r>
-        <w:t>csv</w:t>
-      </w:r>
-      <w:r>
-        <w:rPr>
-          <w:lang w:val="ru-RU"/>
-        </w:rPr>
-        <w:t xml:space="preserve"> файлу. Приклад </w:t>
-      </w:r>
-      <w:r>
-        <w:t>csv</w:t>
-      </w:r>
-      <w:r>
-        <w:rPr>
-          <w:lang w:val="ru-RU"/>
-        </w:rPr>
-        <w:t xml:space="preserve"> файлу (</w:t>
-      </w:r>
-      <w:r>
-        <w:t>lab</w:t>
-      </w:r>
-      <w:r>
-        <w:rPr>
-          <w:lang w:val="ru-RU"/>
-        </w:rPr>
-        <w:t>2.</w:t>
-      </w:r>
-      <w:r>
-        <w:t>csv</w:t>
-      </w:r>
-      <w:r>
-        <w:rPr>
-          <w:lang w:val="ru-RU"/>
-        </w:rPr>
-        <w:t xml:space="preserve">), та оригінальній файл формату </w:t>
-      </w:r>
-      <w:r>
-        <w:t>xlsx</w:t>
-      </w:r>
-      <w:r>
-        <w:rPr>
-          <w:lang w:val="ru-RU"/>
-        </w:rPr>
-        <w:t xml:space="preserve"> розміщені поряд з вказівками. Ім’я файлу для завантаження даних повинно передаватись в якості параметрів командного рядку.</w:t>
-      </w:r>
-    </w:p>
-    <w:p>
-      <w:pPr>
-        <w:pStyle w:val="a6"/>
-        <w:ind w:left="1080" w:firstLine="0"/>
-        <w:rPr>
-          <w:lang w:val="ru-RU"/>
-        </w:rPr>
-      </w:pPr>
-      <w:r>
-        <w:rPr>
-          <w:noProof/>
-          <w:lang w:val="ru-RU"/>
-        </w:rPr>
-        <w:drawing>
-          <wp:inline distT="0" distB="0" distL="0" distR="0" wp14:anchorId="2F1048C5" wp14:editId="300DFD05">
-            <wp:extent cx="5943600" cy="3121660"/>
-            <wp:effectExtent l="0" t="0" r="0" b="2540"/>
-            <wp:docPr id="38" name="Рисунок 38"/>
-            <wp:cNvGraphicFramePr>
-              <a:graphicFrameLocks xmlns:a="http://schemas.openxmlformats.org/drawingml/2006/main" noChangeAspect="1"/>
-            </wp:cNvGraphicFramePr>
-            <a:graphic xmlns:a="http://schemas.openxmlformats.org/drawingml/2006/main">
-              <a:graphicData uri="http://schemas.openxmlformats.org/drawingml/2006/picture">
-                <pic:pic xmlns:pic="http://schemas.openxmlformats.org/drawingml/2006/picture">
-                  <pic:nvPicPr>
-                    <pic:cNvPr id="1" name=""/>
-                    <pic:cNvPicPr/>
-                  </pic:nvPicPr>
-                  <pic:blipFill>
-                    <a:blip r:embed="rId36"/>
-                    <a:stretch>
-                      <a:fillRect/>
-                    </a:stretch>
-                  </pic:blipFill>
-                  <pic:spPr>
-                    <a:xfrm>
-                      <a:off x="0" y="0"/>
-                      <a:ext cx="5943600" cy="3121660"/>
-                    </a:xfrm>
-                    <a:prstGeom prst="rect">
-                      <a:avLst/>
-                    </a:prstGeom>
-                  </pic:spPr>
-                </pic:pic>
-              </a:graphicData>
-            </a:graphic>
-          </wp:inline>
-        </w:drawing>
-      </w:r>
-      <w:r>
-        <w:rPr>
-          <w:lang w:val="ru-RU"/>
-        </w:rPr>
-        <w:br/>
-      </w:r>
-      <w:r>
-        <w:rPr>
-          <w:noProof/>
-          <w:lang w:val="ru-RU"/>
-        </w:rPr>
-        <w:drawing>
-          <wp:inline distT="0" distB="0" distL="0" distR="0" wp14:anchorId="4282DF3D" wp14:editId="31BB03FF">
-            <wp:extent cx="5839640" cy="1267002"/>
-            <wp:effectExtent l="0" t="0" r="0" b="9525"/>
-            <wp:docPr id="39" name="Рисунок 39"/>
-            <wp:cNvGraphicFramePr>
-              <a:graphicFrameLocks xmlns:a="http://schemas.openxmlformats.org/drawingml/2006/main" noChangeAspect="1"/>
-            </wp:cNvGraphicFramePr>
-            <a:graphic xmlns:a="http://schemas.openxmlformats.org/drawingml/2006/main">
-              <a:graphicData uri="http://schemas.openxmlformats.org/drawingml/2006/picture">
-                <pic:pic xmlns:pic="http://schemas.openxmlformats.org/drawingml/2006/picture">
-                  <pic:nvPicPr>
-                    <pic:cNvPr id="1" name=""/>
-                    <pic:cNvPicPr/>
-                  </pic:nvPicPr>
-                  <pic:blipFill>
-                    <a:blip r:embed="rId37"/>
-                    <a:stretch>
-                      <a:fillRect/>
-                    </a:stretch>
-                  </pic:blipFill>
-                  <pic:spPr>
-                    <a:xfrm>
-                      <a:off x="0" y="0"/>
-                      <a:ext cx="5839640" cy="1267002"/>
-                    </a:xfrm>
-                    <a:prstGeom prst="rect">
-                      <a:avLst/>
-                    </a:prstGeom>
-                  </pic:spPr>
-                </pic:pic>
-              </a:graphicData>
-            </a:graphic>
-          </wp:inline>
-        </w:drawing>
-      </w:r>
-    </w:p>
-    <w:p>
-      <w:pPr>
-        <w:pStyle w:val="a6"/>
-        <w:ind w:left="1080" w:firstLine="0"/>
-        <w:rPr>
-          <w:lang w:val="ru-RU"/>
-        </w:rPr>
-      </w:pPr>
-    </w:p>
-    <w:p>
-      <w:pPr>
-        <w:pStyle w:val="a6"/>
-        <w:numPr>
-          <w:ilvl w:val="0"/>
-          <w:numId w:val="10"/>
-        </w:numPr>
-        <w:rPr>
-          <w:lang w:val="ru-RU"/>
-        </w:rPr>
-      </w:pPr>
-      <w:r>
-        <w:rPr>
-          <w:b/>
-          <w:bCs/>
-          <w:lang w:val="ru-RU"/>
-        </w:rPr>
-        <w:t>зберігання</w:t>
-      </w:r>
-      <w:r>
-        <w:rPr>
-          <w:lang w:val="ru-RU"/>
-        </w:rPr>
-        <w:t xml:space="preserve"> довідника студентів у форматі </w:t>
-      </w:r>
-      <w:r>
-        <w:t>CSV</w:t>
-      </w:r>
-      <w:r>
-        <w:rPr>
-          <w:lang w:val="ru-RU"/>
-        </w:rPr>
-        <w:t xml:space="preserve"> перед виходом із програми.</w:t>
-      </w:r>
-    </w:p>
-    <w:p>
-      <w:pPr>
-        <w:pStyle w:val="a6"/>
-        <w:ind w:left="1080" w:firstLine="0"/>
-        <w:rPr>
-          <w:lang w:val="ru-RU"/>
-        </w:rPr>
-      </w:pPr>
-      <w:r>
-        <w:rPr>
-          <w:noProof/>
-          <w:lang w:val="ru-RU"/>
-        </w:rPr>
-        <w:lastRenderedPageBreak/>
-        <w:drawing>
-          <wp:inline distT="0" distB="0" distL="0" distR="0" wp14:anchorId="42740929" wp14:editId="78903FC2">
-            <wp:extent cx="3524742" cy="914528"/>
-            <wp:effectExtent l="0" t="0" r="0" b="0"/>
-            <wp:docPr id="40" name="Рисунок 40"/>
-            <wp:cNvGraphicFramePr>
-              <a:graphicFrameLocks xmlns:a="http://schemas.openxmlformats.org/drawingml/2006/main" noChangeAspect="1"/>
-            </wp:cNvGraphicFramePr>
-            <a:graphic xmlns:a="http://schemas.openxmlformats.org/drawingml/2006/main">
-              <a:graphicData uri="http://schemas.openxmlformats.org/drawingml/2006/picture">
-                <pic:pic xmlns:pic="http://schemas.openxmlformats.org/drawingml/2006/picture">
-                  <pic:nvPicPr>
-                    <pic:cNvPr id="1" name=""/>
-                    <pic:cNvPicPr/>
-                  </pic:nvPicPr>
-                  <pic:blipFill>
-                    <a:blip r:embed="rId38"/>
-                    <a:stretch>
-                      <a:fillRect/>
-                    </a:stretch>
-                  </pic:blipFill>
-                  <pic:spPr>
-                    <a:xfrm>
-                      <a:off x="0" y="0"/>
-                      <a:ext cx="3524742" cy="914528"/>
-                    </a:xfrm>
-                    <a:prstGeom prst="rect">
-                      <a:avLst/>
-                    </a:prstGeom>
-                  </pic:spPr>
-                </pic:pic>
-              </a:graphicData>
-            </a:graphic>
-          </wp:inline>
-        </w:drawing>
-      </w:r>
-    </w:p>
-    <w:p>
-      <w:pPr>
-        <w:pStyle w:val="a6"/>
-        <w:ind w:left="1080" w:firstLine="0"/>
-        <w:rPr>
-          <w:lang w:val="ru-RU"/>
-        </w:rPr>
-      </w:pPr>
-      <w:r>
-        <w:rPr>
-          <w:noProof/>
-          <w:lang w:val="ru-RU"/>
-        </w:rPr>
-        <w:drawing>
-          <wp:inline distT="0" distB="0" distL="0" distR="0" wp14:anchorId="7808A1C0" wp14:editId="4B9D2E7D">
-            <wp:extent cx="5943600" cy="3070225"/>
-            <wp:effectExtent l="0" t="0" r="0" b="0"/>
-            <wp:docPr id="41" name="Рисунок 41"/>
-            <wp:cNvGraphicFramePr>
-              <a:graphicFrameLocks xmlns:a="http://schemas.openxmlformats.org/drawingml/2006/main" noChangeAspect="1"/>
-            </wp:cNvGraphicFramePr>
-            <a:graphic xmlns:a="http://schemas.openxmlformats.org/drawingml/2006/main">
-              <a:graphicData uri="http://schemas.openxmlformats.org/drawingml/2006/picture">
-                <pic:pic xmlns:pic="http://schemas.openxmlformats.org/drawingml/2006/picture">
-                  <pic:nvPicPr>
-                    <pic:cNvPr id="1" name=""/>
-                    <pic:cNvPicPr/>
-                  </pic:nvPicPr>
-                  <pic:blipFill>
-                    <a:blip r:embed="rId39"/>
-                    <a:stretch>
-                      <a:fillRect/>
-                    </a:stretch>
-                  </pic:blipFill>
-                  <pic:spPr>
-                    <a:xfrm>
-                      <a:off x="0" y="0"/>
-                      <a:ext cx="5943600" cy="3070225"/>
-                    </a:xfrm>
-                    <a:prstGeom prst="rect">
-                      <a:avLst/>
-                    </a:prstGeom>
-                  </pic:spPr>
-                </pic:pic>
-              </a:graphicData>
-            </a:graphic>
-          </wp:inline>
-        </w:drawing>
-      </w:r>
-    </w:p>
-    <w:p>
-      <w:pPr>
-        <w:spacing w:line="259" w:lineRule="auto"/>
-        <w:ind w:firstLine="0"/>
-        <w:jc w:val="left"/>
-        <w:rPr>
-          <w:lang w:val="ru-RU"/>
-        </w:rPr>
-      </w:pPr>
-      <w:r>
-        <w:rPr>
-          <w:lang w:val="ru-RU"/>
-        </w:rPr>
-        <w:br w:type="page"/>
-      </w:r>
-    </w:p>
-    <w:p>
-      <w:pPr>
-        <w:pStyle w:val="a6"/>
-        <w:ind w:left="1080" w:firstLine="0"/>
-        <w:rPr>
-          <w:lang w:val="ru-RU"/>
-        </w:rPr>
-      </w:pPr>
-    </w:p>
-    <w:p>
-      <w:pPr>
-        <w:pStyle w:val="a6"/>
-        <w:numPr>
-          <w:ilvl w:val="0"/>
-          <w:numId w:val="10"/>
-        </w:numPr>
-        <w:rPr>
-          <w:lang w:val="ru-RU"/>
-        </w:rPr>
-      </w:pPr>
-      <w:r>
-        <w:rPr>
-          <w:lang w:val="ru-RU"/>
-        </w:rPr>
-        <w:t xml:space="preserve">покриття основного функціоналу програми </w:t>
-      </w:r>
-      <w:r>
-        <w:rPr>
-          <w:b/>
-          <w:bCs/>
-          <w:lang w:val="ru-RU"/>
-        </w:rPr>
-        <w:t>Юніт тестами</w:t>
-      </w:r>
-      <w:r>
-        <w:rPr>
-          <w:lang w:val="ru-RU"/>
-        </w:rPr>
-        <w:t>.</w:t>
-      </w:r>
-    </w:p>
-    <w:p>
-      <w:pPr>
-        <w:rPr>
-          <w:lang w:val="ru-RU"/>
-        </w:rPr>
-      </w:pPr>
-      <w:r>
-        <w:rPr>
-          <w:noProof/>
-          <w:lang w:val="ru-RU"/>
-        </w:rPr>
-        <w:drawing>
-          <wp:inline distT="0" distB="0" distL="0" distR="0" wp14:anchorId="39E321F1" wp14:editId="172C12FF">
-            <wp:extent cx="5943600" cy="6814185"/>
-            <wp:effectExtent l="0" t="0" r="0" b="5715"/>
-            <wp:docPr id="42" name="Рисунок 42"/>
-            <wp:cNvGraphicFramePr>
-              <a:graphicFrameLocks xmlns:a="http://schemas.openxmlformats.org/drawingml/2006/main" noChangeAspect="1"/>
-            </wp:cNvGraphicFramePr>
-            <a:graphic xmlns:a="http://schemas.openxmlformats.org/drawingml/2006/main">
-              <a:graphicData uri="http://schemas.openxmlformats.org/drawingml/2006/picture">
-                <pic:pic xmlns:pic="http://schemas.openxmlformats.org/drawingml/2006/picture">
-                  <pic:nvPicPr>
-                    <pic:cNvPr id="1" name=""/>
-                    <pic:cNvPicPr/>
-                  </pic:nvPicPr>
-                  <pic:blipFill>
-                    <a:blip r:embed="rId40"/>
-                    <a:stretch>
-                      <a:fillRect/>
-                    </a:stretch>
-                  </pic:blipFill>
-                  <pic:spPr>
-                    <a:xfrm>
-                      <a:off x="0" y="0"/>
-                      <a:ext cx="5943600" cy="6814185"/>
-                    </a:xfrm>
-                    <a:prstGeom prst="rect">
-                      <a:avLst/>
-                    </a:prstGeom>
-                  </pic:spPr>
-                </pic:pic>
-              </a:graphicData>
-            </a:graphic>
-          </wp:inline>
-        </w:drawing>
-      </w:r>
-    </w:p>
-    <w:p>
-      <w:pPr>
-        <w:spacing w:line="259" w:lineRule="auto"/>
-        <w:ind w:firstLine="0"/>
-        <w:jc w:val="left"/>
-        <w:rPr>
-          <w:lang w:val="ru-RU"/>
-        </w:rPr>
-      </w:pPr>
-      <w:r>
-        <w:rPr>
-          <w:lang w:val="ru-RU"/>
-        </w:rPr>
-        <w:br w:type="page"/>
-      </w:r>
-    </w:p>
-    <w:p>
-      <w:pPr>
-        <w:rPr>
-          <w:lang w:val="ru-RU"/>
-        </w:rPr>
-      </w:pPr>
-    </w:p>
-    <w:p>
-      <w:pPr>
-        <w:jc w:val="right"/>
-        <w:rPr>
-          <w:lang w:val="ru-RU"/>
-        </w:rPr>
-      </w:pPr>
-      <w:r>
-        <w:rPr>
-          <w:lang w:val="uk-UA"/>
-        </w:rPr>
-        <w:t>Звіт до Лабораторної роботи №</w:t>
-      </w:r>
-      <w:r>
-        <w:rPr>
-          <w:lang w:val="ru-RU"/>
-        </w:rPr>
-        <w:t>3</w:t>
-      </w:r>
-    </w:p>
-    <w:p>
-      <w:pPr>
-        <w:rPr>
-          <w:lang w:val="uk-UA"/>
-        </w:rPr>
-      </w:pPr>
-      <w:r>
-        <w:rPr>
-          <w:lang w:val="uk-UA"/>
-        </w:rPr>
-        <w:t>Під час виконання Лабораторної роботи №</w:t>
-      </w:r>
-      <w:r>
-        <w:rPr>
-          <w:lang w:val="ru-RU"/>
-        </w:rPr>
-        <w:t>2</w:t>
-      </w:r>
-      <w:r>
-        <w:rPr>
-          <w:lang w:val="uk-UA"/>
-        </w:rPr>
-        <w:t xml:space="preserve"> було надано варіанти рішення до наступних задач:</w:t>
-      </w:r>
-    </w:p>
-    <w:p>
-      <w:pPr>
-        <w:pStyle w:val="a6"/>
-        <w:numPr>
-          <w:ilvl w:val="0"/>
-          <w:numId w:val="11"/>
-        </w:numPr>
-        <w:rPr>
-          <w:lang w:val="ru-RU"/>
-        </w:rPr>
-      </w:pPr>
-      <w:r>
-        <w:rPr>
-          <w:lang w:val="ru-RU"/>
-        </w:rPr>
-        <w:t>розробити клас Студент групи з відповідними атрибутами;</w:t>
-      </w:r>
-    </w:p>
-    <w:p>
-      <w:pPr>
-        <w:pStyle w:val="a6"/>
-        <w:ind w:left="1080" w:firstLine="0"/>
-        <w:rPr>
-          <w:lang w:val="ru-RU"/>
-        </w:rPr>
-      </w:pPr>
-      <w:r>
-        <w:rPr>
-          <w:noProof/>
-          <w:lang w:val="ru-RU"/>
-        </w:rPr>
-        <w:drawing>
-          <wp:inline distT="0" distB="0" distL="0" distR="0" wp14:anchorId="5ED01FE5" wp14:editId="4140AC8F">
-            <wp:extent cx="5943600" cy="3144520"/>
-            <wp:effectExtent l="0" t="0" r="0" b="0"/>
-            <wp:docPr id="43" name="Рисунок 43"/>
-            <wp:cNvGraphicFramePr>
-              <a:graphicFrameLocks xmlns:a="http://schemas.openxmlformats.org/drawingml/2006/main" noChangeAspect="1"/>
-            </wp:cNvGraphicFramePr>
-            <a:graphic xmlns:a="http://schemas.openxmlformats.org/drawingml/2006/main">
-              <a:graphicData uri="http://schemas.openxmlformats.org/drawingml/2006/picture">
-                <pic:pic xmlns:pic="http://schemas.openxmlformats.org/drawingml/2006/picture">
-                  <pic:nvPicPr>
-                    <pic:cNvPr id="1" name=""/>
-                    <pic:cNvPicPr/>
-                  </pic:nvPicPr>
-                  <pic:blipFill>
-                    <a:blip r:embed="rId41"/>
-                    <a:stretch>
-                      <a:fillRect/>
-                    </a:stretch>
-                  </pic:blipFill>
-                  <pic:spPr>
-                    <a:xfrm>
-                      <a:off x="0" y="0"/>
-                      <a:ext cx="5943600" cy="3144520"/>
-                    </a:xfrm>
-                    <a:prstGeom prst="rect">
-                      <a:avLst/>
-                    </a:prstGeom>
-                  </pic:spPr>
-                </pic:pic>
-              </a:graphicData>
-            </a:graphic>
-          </wp:inline>
-        </w:drawing>
-      </w:r>
-    </w:p>
-    <w:p>
-      <w:pPr>
-        <w:pStyle w:val="a6"/>
-        <w:numPr>
-          <w:ilvl w:val="0"/>
-          <w:numId w:val="11"/>
-        </w:numPr>
-        <w:rPr>
-          <w:lang w:val="ru-RU"/>
-        </w:rPr>
-      </w:pPr>
-      <w:r>
-        <w:rPr>
-          <w:lang w:val="ru-RU"/>
-        </w:rPr>
-        <w:t>розробити клас Список групи, має містити не словники, як виконано в лабораторній роботі №2, а об’єкти класу Студент групи; додавання нового запису, видаленні існуючого чи зміна даних має бути виконана через методи класу Список групи.</w:t>
-      </w:r>
-    </w:p>
-    <w:p>
-      <w:pPr>
-        <w:pStyle w:val="a6"/>
-        <w:ind w:left="1080" w:firstLine="0"/>
-        <w:rPr>
-          <w:lang w:val="ru-RU"/>
-        </w:rPr>
-      </w:pPr>
-      <w:r>
-        <w:rPr>
-          <w:noProof/>
-          <w:lang w:val="ru-RU"/>
-        </w:rPr>
-        <w:lastRenderedPageBreak/>
-        <w:drawing>
-          <wp:inline distT="0" distB="0" distL="0" distR="0" wp14:anchorId="580557AE" wp14:editId="51EAE5D3">
-            <wp:extent cx="5943600" cy="5797550"/>
-            <wp:effectExtent l="0" t="0" r="0" b="0"/>
-            <wp:docPr id="44" name="Рисунок 44"/>
-            <wp:cNvGraphicFramePr>
-              <a:graphicFrameLocks xmlns:a="http://schemas.openxmlformats.org/drawingml/2006/main" noChangeAspect="1"/>
-            </wp:cNvGraphicFramePr>
-            <a:graphic xmlns:a="http://schemas.openxmlformats.org/drawingml/2006/main">
-              <a:graphicData uri="http://schemas.openxmlformats.org/drawingml/2006/picture">
-                <pic:pic xmlns:pic="http://schemas.openxmlformats.org/drawingml/2006/picture">
-                  <pic:nvPicPr>
-                    <pic:cNvPr id="1" name=""/>
-                    <pic:cNvPicPr/>
-                  </pic:nvPicPr>
-                  <pic:blipFill>
-                    <a:blip r:embed="rId42"/>
-                    <a:stretch>
-                      <a:fillRect/>
-                    </a:stretch>
-                  </pic:blipFill>
-                  <pic:spPr>
-                    <a:xfrm>
-                      <a:off x="0" y="0"/>
-                      <a:ext cx="5943600" cy="5797550"/>
-                    </a:xfrm>
-                    <a:prstGeom prst="rect">
-                      <a:avLst/>
-                    </a:prstGeom>
-                  </pic:spPr>
-                </pic:pic>
-              </a:graphicData>
-            </a:graphic>
-          </wp:inline>
-        </w:drawing>
-      </w:r>
-    </w:p>
-    <w:p>
-      <w:pPr>
-        <w:pStyle w:val="a6"/>
-        <w:ind w:left="1080" w:firstLine="0"/>
-        <w:rPr>
-          <w:lang w:val="ru-RU"/>
-        </w:rPr>
-      </w:pPr>
-      <w:r>
-        <w:rPr>
-          <w:noProof/>
-          <w:lang w:val="ru-RU"/>
-        </w:rPr>
-        <w:drawing>
-          <wp:inline distT="0" distB="0" distL="0" distR="0" wp14:anchorId="45B52EC3" wp14:editId="62F33F83">
-            <wp:extent cx="5943600" cy="2102485"/>
-            <wp:effectExtent l="0" t="0" r="0" b="0"/>
-            <wp:docPr id="45" name="Рисунок 45"/>
-            <wp:cNvGraphicFramePr>
-              <a:graphicFrameLocks xmlns:a="http://schemas.openxmlformats.org/drawingml/2006/main" noChangeAspect="1"/>
-            </wp:cNvGraphicFramePr>
-            <a:graphic xmlns:a="http://schemas.openxmlformats.org/drawingml/2006/main">
-              <a:graphicData uri="http://schemas.openxmlformats.org/drawingml/2006/picture">
-                <pic:pic xmlns:pic="http://schemas.openxmlformats.org/drawingml/2006/picture">
-                  <pic:nvPicPr>
-                    <pic:cNvPr id="1" name=""/>
-                    <pic:cNvPicPr/>
-                  </pic:nvPicPr>
-                  <pic:blipFill>
-                    <a:blip r:embed="rId43"/>
-                    <a:stretch>
-                      <a:fillRect/>
-                    </a:stretch>
-                  </pic:blipFill>
-                  <pic:spPr>
-                    <a:xfrm>
-                      <a:off x="0" y="0"/>
-                      <a:ext cx="5943600" cy="2102485"/>
-                    </a:xfrm>
-                    <a:prstGeom prst="rect">
-                      <a:avLst/>
-                    </a:prstGeom>
-                  </pic:spPr>
-                </pic:pic>
-              </a:graphicData>
-            </a:graphic>
-          </wp:inline>
-        </w:drawing>
-      </w:r>
-    </w:p>
-    <w:p>
-      <w:pPr>
-        <w:pStyle w:val="a6"/>
-        <w:numPr>
-          <w:ilvl w:val="0"/>
-          <w:numId w:val="11"/>
-        </w:numPr>
-        <w:rPr>
-          <w:lang w:val="ru-RU"/>
-        </w:rPr>
-      </w:pPr>
-      <w:r>
-        <w:rPr>
-          <w:lang w:val="ru-RU"/>
-        </w:rPr>
-        <w:lastRenderedPageBreak/>
-        <w:t>розробити клас для роботи з файлами для зчитування початкової інформації про список групи та збереження інформації по завершенню програми.</w:t>
-      </w:r>
-    </w:p>
-    <w:p>
-      <w:pPr>
-        <w:pStyle w:val="a6"/>
-        <w:ind w:left="1080" w:firstLine="0"/>
-        <w:rPr>
-          <w:lang w:val="ru-RU"/>
-        </w:rPr>
-      </w:pPr>
-      <w:r>
-        <w:rPr>
-          <w:noProof/>
-          <w:lang w:val="ru-RU"/>
-        </w:rPr>
-        <w:drawing>
-          <wp:inline distT="0" distB="0" distL="0" distR="0" wp14:anchorId="728F8268" wp14:editId="068AD23C">
-            <wp:extent cx="4734586" cy="2105319"/>
-            <wp:effectExtent l="0" t="0" r="8890" b="9525"/>
-            <wp:docPr id="46" name="Рисунок 46"/>
-            <wp:cNvGraphicFramePr>
-              <a:graphicFrameLocks xmlns:a="http://schemas.openxmlformats.org/drawingml/2006/main" noChangeAspect="1"/>
-            </wp:cNvGraphicFramePr>
-            <a:graphic xmlns:a="http://schemas.openxmlformats.org/drawingml/2006/main">
-              <a:graphicData uri="http://schemas.openxmlformats.org/drawingml/2006/picture">
-                <pic:pic xmlns:pic="http://schemas.openxmlformats.org/drawingml/2006/picture">
-                  <pic:nvPicPr>
-                    <pic:cNvPr id="1" name=""/>
-                    <pic:cNvPicPr/>
-                  </pic:nvPicPr>
-                  <pic:blipFill>
-                    <a:blip r:embed="rId44"/>
-                    <a:stretch>
-                      <a:fillRect/>
-                    </a:stretch>
-                  </pic:blipFill>
-                  <pic:spPr>
-                    <a:xfrm>
-                      <a:off x="0" y="0"/>
-                      <a:ext cx="4734586" cy="2105319"/>
-                    </a:xfrm>
-                    <a:prstGeom prst="rect">
-                      <a:avLst/>
-                    </a:prstGeom>
-                  </pic:spPr>
-                </pic:pic>
-              </a:graphicData>
-            </a:graphic>
-          </wp:inline>
-        </w:drawing>
-      </w:r>
-    </w:p>
-    <w:p>
-      <w:pPr>
-        <w:pStyle w:val="a6"/>
-        <w:ind w:left="1080" w:firstLine="0"/>
-        <w:rPr>
-          <w:lang w:val="ru-RU"/>
-        </w:rPr>
-      </w:pPr>
-      <w:r>
-        <w:rPr>
-          <w:noProof/>
-          <w:lang w:val="ru-RU"/>
-        </w:rPr>
-        <w:drawing>
-          <wp:inline distT="0" distB="0" distL="0" distR="0" wp14:anchorId="685CED92" wp14:editId="5012EDCD">
-            <wp:extent cx="4115374" cy="781159"/>
-            <wp:effectExtent l="0" t="0" r="0" b="0"/>
-            <wp:docPr id="47" name="Рисунок 47"/>
-            <wp:cNvGraphicFramePr>
-              <a:graphicFrameLocks xmlns:a="http://schemas.openxmlformats.org/drawingml/2006/main" noChangeAspect="1"/>
-            </wp:cNvGraphicFramePr>
-            <a:graphic xmlns:a="http://schemas.openxmlformats.org/drawingml/2006/main">
-              <a:graphicData uri="http://schemas.openxmlformats.org/drawingml/2006/picture">
-                <pic:pic xmlns:pic="http://schemas.openxmlformats.org/drawingml/2006/picture">
-                  <pic:nvPicPr>
-                    <pic:cNvPr id="1" name=""/>
-                    <pic:cNvPicPr/>
-                  </pic:nvPicPr>
-                  <pic:blipFill>
-                    <a:blip r:embed="rId45"/>
-                    <a:stretch>
-                      <a:fillRect/>
-                    </a:stretch>
-                  </pic:blipFill>
-                  <pic:spPr>
-                    <a:xfrm>
-                      <a:off x="0" y="0"/>
-                      <a:ext cx="4115374" cy="781159"/>
-                    </a:xfrm>
-                    <a:prstGeom prst="rect">
-                      <a:avLst/>
-                    </a:prstGeom>
-                  </pic:spPr>
-                </pic:pic>
-              </a:graphicData>
-            </a:graphic>
-          </wp:inline>
-        </w:drawing>
-      </w:r>
-    </w:p>
-    <w:p>
-      <w:pPr>
-        <w:pStyle w:val="a6"/>
-        <w:numPr>
-          <w:ilvl w:val="0"/>
-          <w:numId w:val="11"/>
-        </w:numPr>
-        <w:rPr>
-          <w:lang w:val="ru-RU"/>
-        </w:rPr>
-      </w:pPr>
-      <w:r>
-        <w:rPr>
-          <w:lang w:val="ru-RU"/>
-        </w:rPr>
-        <w:t>список студентів має містити не словники, як виконано в лабораторній роботі №2, а об’єкти класу Студент групи;</w:t>
-      </w:r>
-    </w:p>
-    <w:p>
-      <w:pPr>
-        <w:pStyle w:val="a6"/>
-        <w:ind w:left="1080" w:firstLine="0"/>
-        <w:rPr>
-          <w:lang w:val="ru-RU"/>
-        </w:rPr>
-      </w:pPr>
-      <w:r>
-        <w:rPr>
-          <w:noProof/>
-          <w:lang w:val="ru-RU"/>
-        </w:rPr>
-        <w:drawing>
-          <wp:inline distT="0" distB="0" distL="0" distR="0" wp14:anchorId="0C207FC7" wp14:editId="55D2A266">
-            <wp:extent cx="4001058" cy="1190791"/>
-            <wp:effectExtent l="0" t="0" r="0" b="9525"/>
-            <wp:docPr id="48" name="Рисунок 48"/>
-            <wp:cNvGraphicFramePr>
-              <a:graphicFrameLocks xmlns:a="http://schemas.openxmlformats.org/drawingml/2006/main" noChangeAspect="1"/>
-            </wp:cNvGraphicFramePr>
-            <a:graphic xmlns:a="http://schemas.openxmlformats.org/drawingml/2006/main">
-              <a:graphicData uri="http://schemas.openxmlformats.org/drawingml/2006/picture">
-                <pic:pic xmlns:pic="http://schemas.openxmlformats.org/drawingml/2006/picture">
-                  <pic:nvPicPr>
-                    <pic:cNvPr id="1" name=""/>
-                    <pic:cNvPicPr/>
-                  </pic:nvPicPr>
-                  <pic:blipFill>
-                    <a:blip r:embed="rId46"/>
-                    <a:stretch>
-                      <a:fillRect/>
-                    </a:stretch>
-                  </pic:blipFill>
-                  <pic:spPr>
-                    <a:xfrm>
-                      <a:off x="0" y="0"/>
-                      <a:ext cx="4001058" cy="1190791"/>
-                    </a:xfrm>
-                    <a:prstGeom prst="rect">
-                      <a:avLst/>
-                    </a:prstGeom>
-                  </pic:spPr>
-                </pic:pic>
-              </a:graphicData>
-            </a:graphic>
-          </wp:inline>
-        </w:drawing>
-      </w:r>
-    </w:p>
-    <w:p>
-      <w:pPr>
-        <w:pStyle w:val="a6"/>
-        <w:numPr>
-          <w:ilvl w:val="0"/>
-          <w:numId w:val="11"/>
-        </w:numPr>
-        <w:rPr>
-          <w:lang w:val="ru-RU"/>
-        </w:rPr>
-      </w:pPr>
-      <w:r>
-        <w:rPr>
-          <w:lang w:val="ru-RU"/>
-        </w:rPr>
-        <w:t xml:space="preserve">описання всіх класів мають міститися в окремих файлах, що мають відповідні імена(наприклад </w:t>
-      </w:r>
-      <w:r>
-        <w:t>Studen</w:t>
-      </w:r>
-      <w:r>
-        <w:rPr>
-          <w:lang w:val="ru-RU"/>
-        </w:rPr>
-        <w:t xml:space="preserve">, </w:t>
-      </w:r>
-      <w:r>
-        <w:t>StudentList</w:t>
-      </w:r>
-      <w:r>
-        <w:rPr>
-          <w:lang w:val="ru-RU"/>
-        </w:rPr>
-        <w:t xml:space="preserve">, </w:t>
-      </w:r>
-      <w:r>
-        <w:t>Utils</w:t>
-      </w:r>
-      <w:r>
-        <w:rPr>
-          <w:lang w:val="ru-RU"/>
-        </w:rPr>
-        <w:t>)</w:t>
-      </w:r>
-    </w:p>
-    <w:p>
-      <w:pPr>
-        <w:pStyle w:val="a6"/>
-        <w:ind w:left="1080" w:firstLine="0"/>
-        <w:rPr>
-          <w:lang w:val="ru-RU"/>
-        </w:rPr>
-      </w:pPr>
-      <w:r>
-        <w:rPr>
-          <w:noProof/>
-          <w:lang w:val="ru-RU"/>
-        </w:rPr>
-        <w:drawing>
-          <wp:inline distT="0" distB="0" distL="0" distR="0" wp14:anchorId="1EC1435E" wp14:editId="7742280A">
-            <wp:extent cx="2314898" cy="1657581"/>
-            <wp:effectExtent l="0" t="0" r="9525" b="0"/>
-            <wp:docPr id="49" name="Рисунок 49"/>
-            <wp:cNvGraphicFramePr>
-              <a:graphicFrameLocks xmlns:a="http://schemas.openxmlformats.org/drawingml/2006/main" noChangeAspect="1"/>
-            </wp:cNvGraphicFramePr>
-            <a:graphic xmlns:a="http://schemas.openxmlformats.org/drawingml/2006/main">
-              <a:graphicData uri="http://schemas.openxmlformats.org/drawingml/2006/picture">
-                <pic:pic xmlns:pic="http://schemas.openxmlformats.org/drawingml/2006/picture">
-                  <pic:nvPicPr>
-                    <pic:cNvPr id="1" name=""/>
-                    <pic:cNvPicPr/>
-                  </pic:nvPicPr>
-                  <pic:blipFill>
-                    <a:blip r:embed="rId47"/>
-                    <a:stretch>
-                      <a:fillRect/>
-                    </a:stretch>
-                  </pic:blipFill>
-                  <pic:spPr>
-                    <a:xfrm>
-                      <a:off x="0" y="0"/>
-                      <a:ext cx="2314898" cy="1657581"/>
-                    </a:xfrm>
-                    <a:prstGeom prst="rect">
-                      <a:avLst/>
-                    </a:prstGeom>
-                  </pic:spPr>
-                </pic:pic>
-              </a:graphicData>
-            </a:graphic>
-          </wp:inline>
-        </w:drawing>
-      </w:r>
-    </w:p>
-    <w:p>
-      <w:pPr>
-        <w:pStyle w:val="a6"/>
-        <w:numPr>
-          <w:ilvl w:val="0"/>
-          <w:numId w:val="11"/>
-        </w:numPr>
-        <w:rPr>
-          <w:lang w:val="ru-RU"/>
-        </w:rPr>
-      </w:pPr>
-      <w:r>
-        <w:rPr>
-          <w:lang w:val="ru-RU"/>
-        </w:rPr>
-        <w:lastRenderedPageBreak/>
-        <w:t>основний функціонал програми має бути покритий Юніт тестами.</w:t>
-      </w:r>
-    </w:p>
-    <w:p>
-      <w:pPr>
-        <w:pStyle w:val="a6"/>
-        <w:ind w:left="1080" w:firstLine="0"/>
-      </w:pPr>
-      <w:r>
-        <w:rPr>
-          <w:noProof/>
-          <w:lang w:val="ru-RU"/>
-        </w:rPr>
-        <w:drawing>
-          <wp:inline distT="0" distB="0" distL="0" distR="0" wp14:anchorId="2B9941EE" wp14:editId="40BD02B6">
-            <wp:extent cx="5943600" cy="4545330"/>
-            <wp:effectExtent l="0" t="0" r="0" b="7620"/>
-            <wp:docPr id="50" name="Рисунок 50"/>
-            <wp:cNvGraphicFramePr>
-              <a:graphicFrameLocks xmlns:a="http://schemas.openxmlformats.org/drawingml/2006/main" noChangeAspect="1"/>
-            </wp:cNvGraphicFramePr>
-            <a:graphic xmlns:a="http://schemas.openxmlformats.org/drawingml/2006/main">
-              <a:graphicData uri="http://schemas.openxmlformats.org/drawingml/2006/picture">
-                <pic:pic xmlns:pic="http://schemas.openxmlformats.org/drawingml/2006/picture">
-                  <pic:nvPicPr>
-                    <pic:cNvPr id="1" name=""/>
-                    <pic:cNvPicPr/>
-                  </pic:nvPicPr>
-                  <pic:blipFill>
-                    <a:blip r:embed="rId48"/>
-                    <a:stretch>
-                      <a:fillRect/>
-                    </a:stretch>
-                  </pic:blipFill>
-                  <pic:spPr>
-                    <a:xfrm>
-                      <a:off x="0" y="0"/>
-                      <a:ext cx="5943600" cy="4545330"/>
-                    </a:xfrm>
-                    <a:prstGeom prst="rect">
-                      <a:avLst/>
-                    </a:prstGeom>
-                  </pic:spPr>
-                </pic:pic>
-              </a:graphicData>
-            </a:graphic>
-          </wp:inline>
-        </w:drawing>
-      </w:r>
-    </w:p>
-    <w:p>
-      <w:pPr>
-        <w:spacing w:line="259" w:lineRule="auto"/>
-        <w:ind w:firstLine="0"/>
-        <w:jc w:val="left"/>
-        <w:rPr>
-          <w:lang w:val="ru-RU"/>
-        </w:rPr>
-      </w:pPr>
-      <w:r>
-        <w:rPr>
-          <w:lang w:val="ru-RU"/>
-        </w:rPr>
-        <w:br w:type="page"/>
-      </w:r>
-    </w:p>
-    <w:p>
-      <w:pPr>
-        <w:rPr>
-          <w:lang w:val="ru-RU"/>
-        </w:rPr>
-      </w:pPr>
-    </w:p>
-    <w:p>
-      <w:pPr>
-        <w:rPr>
-          <w:lang w:val="uk-UA"/>
-        </w:rPr>
-      </w:pPr>
-    </w:p>
-    <w:p>
-      <w:pPr>
-        <w:rPr>
-          <w:lang w:val="ru-RU"/>
-        </w:rPr>
-      </w:pPr>
-      <w:r>
-        <w:rPr>
-          <w:lang w:val="uk-UA"/>
-        </w:rPr>
-        <w:t xml:space="preserve">Посилання на </w:t>
-      </w:r>
-      <w:r>
-        <w:t>github</w:t>
-      </w:r>
-      <w:r>
-        <w:rPr>
-          <w:lang w:val="ru-RU"/>
-        </w:rPr>
-        <w:t>:</w:t>
-      </w:r>
-    </w:p>
-    <w:p>
-      <w:pPr>
-        <w:rPr>
-          <w:lang w:val="ru-RU"/>
-        </w:rPr>
-      </w:pPr>
-      <w:hyperlink r:id="rId49" w:history="1">
-        <w:r>
-          <w:rPr>
-            <w:rStyle w:val="a4"/>
-            <w:lang w:val="ru-RU"/>
-          </w:rPr>
-          <w:t>https://github.com/RickWazowski98/TP-KB-231-Viacheslav-Saievskyi</w:t>
-        </w:r>
-      </w:hyperlink>
-    </w:p>
-    <w:p>
-      <w:pPr>
-        <w:rPr>
-          <w:lang w:val="ru-RU"/>
-        </w:rPr>
-      </w:pPr>
-      <w:r>
-        <w:rPr>
-          <w:lang w:val="uk-UA"/>
-        </w:rPr>
-        <w:t xml:space="preserve">Знімок екрану з посилання на </w:t>
-      </w:r>
-      <w:r>
-        <w:t>github</w:t>
-      </w:r>
-      <w:r>
-        <w:rPr>
-          <w:lang w:val="ru-RU"/>
-        </w:rPr>
-        <w:t>:</w:t>
-      </w:r>
-    </w:p>
-    <w:p>
-      <w:pPr>
-        <w:rPr>
-          <w:lang w:val="ru-RU"/>
-        </w:rPr>
-      </w:pPr>
-      <w:bookmarkStart w:id="0" w:name="_GoBack"/>
-      <w:r>
-        <w:rPr>
-          <w:noProof/>
-          <w:lang w:val="ru-RU"/>
-        </w:rPr>
-        <w:drawing>
-          <wp:inline distT="0" distB="0" distL="0" distR="0" wp14:anchorId="1E7679AF" wp14:editId="1920E07E">
-            <wp:extent cx="5943600" cy="4288790"/>
-            <wp:effectExtent l="0" t="0" r="0" b="0"/>
-            <wp:docPr id="10" name="Рисунок 10"/>
-            <wp:cNvGraphicFramePr>
-              <a:graphicFrameLocks xmlns:a="http://schemas.openxmlformats.org/drawingml/2006/main" noChangeAspect="1"/>
-            </wp:cNvGraphicFramePr>
-            <a:graphic xmlns:a="http://schemas.openxmlformats.org/drawingml/2006/main">
-              <a:graphicData uri="http://schemas.openxmlformats.org/drawingml/2006/picture">
-                <pic:pic xmlns:pic="http://schemas.openxmlformats.org/drawingml/2006/picture">
-                  <pic:nvPicPr>
-                    <pic:cNvPr id="1" name=""/>
-                    <pic:cNvPicPr/>
-                  </pic:nvPicPr>
-                  <pic:blipFill>
-                    <a:blip r:embed="rId50"/>
-                    <a:stretch>
-                      <a:fillRect/>
-                    </a:stretch>
-                  </pic:blipFill>
-                  <pic:spPr>
-                    <a:xfrm>
-                      <a:off x="0" y="0"/>
                       <a:ext cx="5943600" cy="4288790"/>
                     </a:xfrm>
                     <a:prstGeom prst="rect">
@@ -7090,7 +6740,6 @@
           </wp:inline>
         </w:drawing>
       </w:r>
-      <w:bookmarkEnd w:id="0"/>
     </w:p>
     <w:sectPr>
       <w:pgSz w:w="12240" w:h="15840"/>
@@ -8637,7 +8286,7 @@
   <w:style w:type="paragraph" w:default="1" w:styleId="a">
     <w:name w:val="Normal"/>
     <w:qFormat/>
-    <w:rsid w:val="00CA17C4"/>
+    <w:rsid w:val="006433A6"/>
     <w:pPr>
       <w:spacing w:line="360" w:lineRule="auto"/>
       <w:ind w:firstLine="720"/>

</xml_diff>